<commit_message>
add MaAslin2 and init snakemake
</commit_message>
<xml_diff>
--- a/Manuscript/Manuscript_V02_CAH.docx
+++ b/Manuscript/Manuscript_V02_CAH.docx
@@ -48,6 +48,19 @@
     </w:sdt>
     <w:p>
       <w:pPr>
+        <w:pStyle w:val="Normal"/>
+        <w:rPr>
+          <w:rFonts w:ascii="Arial" w:hAnsi="Arial" w:cs="Arial"/>
+        </w:rPr>
+      </w:pPr>
+      <w:r>
+        <w:rPr>
+          <w:rFonts w:cs="Arial" w:ascii="Arial" w:hAnsi="Arial"/>
+        </w:rPr>
+      </w:r>
+    </w:p>
+    <w:p>
+      <w:pPr>
         <w:pStyle w:val="TOCHeading"/>
         <w:jc w:val="center"/>
         <w:rPr>
@@ -513,6 +526,7 @@
     <w:p>
       <w:pPr>
         <w:pStyle w:val="Heading2"/>
+        <w:spacing w:before="0" w:after="80"/>
         <w:rPr>
           <w:rFonts w:ascii="Arial" w:hAnsi="Arial" w:cs="Arial"/>
         </w:rPr>
@@ -682,10 +696,6 @@
                   <a:graphicData uri="http://schemas.microsoft.com/office/word/2010/wordprocessingShape">
                     <wps:wsp>
                       <wps:cNvSpPr/>
-                      <wps:nvSpPr>
-                        <wps:cNvPr id="2" name="Rechteck 1"/>
-                        <wps:cNvSpPr/>
-                      </wps:nvSpPr>
                       <wps:spPr>
                         <a:xfrm>
                           <a:off x="0" y="0"/>
@@ -703,6 +713,12 @@
                           </a:solidFill>
                         </a:ln>
                       </wps:spPr>
+                      <wps:style>
+                        <a:lnRef idx="0"/>
+                        <a:fillRef idx="0"/>
+                        <a:effectRef idx="0"/>
+                        <a:fontRef idx="minor"/>
+                      </wps:style>
                       <wps:bodyPr/>
                     </wps:wsp>
                   </a:graphicData>
@@ -712,10 +728,10 @@
           </mc:Choice>
           <mc:Fallback>
             <w:pict>
-              <v:rect id="shape_0" ID="Rechteck 1" fillcolor="white" stroked="t" o:allowincell="f" style="position:absolute;margin-left:0pt;margin-top:-1.55pt;width:467.95pt;height:1.45pt;mso-wrap-style:none;v-text-anchor:middle;mso-position-vertical:top">
+              <v:rect id="shape_0" ID="Rechteck 1" path="m0,0l-2147483645,0l-2147483645,-2147483646l0,-2147483646xe" fillcolor="white" stroked="t" o:allowincell="f" style="position:absolute;margin-left:0pt;margin-top:-1.55pt;width:467.95pt;height:1.45pt;mso-wrap-style:none;v-text-anchor:middle;mso-position-vertical:top">
                 <v:fill o:detectmouseclick="t" type="solid" color2="black"/>
                 <v:stroke color="black" joinstyle="round" endcap="flat"/>
-                <w10:wrap type="none"/>
+                <w10:wrap type="square"/>
               </v:rect>
             </w:pict>
           </mc:Fallback>
@@ -945,18 +961,10 @@
           <w:rPr>
             <w:rFonts w:cs="Arial" w:ascii="Arial" w:hAnsi="Arial"/>
           </w:rPr>
-          <w:t xml:space="preserve">, </w:t>
+          <w:t>, upper panel</w:t>
         </w:r>
       </w:ins>
-      <w:ins w:id="2" w:author="Unknown Author" w:date="2026-05-29T10:14:32Z">
-        <w:r>
-          <w:rPr>
-            <w:rFonts w:cs="Arial" w:ascii="Arial" w:hAnsi="Arial"/>
-          </w:rPr>
-          <w:t>upper panel</w:t>
-        </w:r>
-      </w:ins>
-      <w:del w:id="3" w:author="Unknown Author" w:date="2026-05-29T09:51:20Z">
+      <w:del w:id="2" w:author="Unknown Author" w:date="2026-05-29T09:51:20Z">
         <w:r>
           <w:rPr>
             <w:rFonts w:cs="Arial" w:ascii="Arial" w:hAnsi="Arial"/>
@@ -979,7 +987,7 @@
         </w:rPr>
         <w:t xml:space="preserve">), including </w:t>
       </w:r>
-      <w:ins w:id="4" w:author="Unknown Author" w:date="2026-05-29T09:14:22Z">
+      <w:ins w:id="3" w:author="Unknown Author" w:date="2026-05-29T09:14:22Z">
         <w:r>
           <w:rPr>
             <w:rFonts w:cs="Arial" w:ascii="Arial" w:hAnsi="Arial"/>
@@ -987,7 +995,7 @@
           <w:t>78</w:t>
         </w:r>
       </w:ins>
-      <w:del w:id="5" w:author="Unknown Author" w:date="2026-05-29T09:14:20Z">
+      <w:del w:id="4" w:author="Unknown Author" w:date="2026-05-29T09:14:20Z">
         <w:r>
           <w:rPr>
             <w:rFonts w:cs="Arial" w:ascii="Arial" w:hAnsi="Arial"/>
@@ -1001,7 +1009,7 @@
         </w:rPr>
         <w:t xml:space="preserve"> blank paraffin scratches (paraffin controls), </w:t>
       </w:r>
-      <w:ins w:id="6" w:author="Unknown Author" w:date="2026-05-29T09:14:43Z">
+      <w:ins w:id="5" w:author="Unknown Author" w:date="2026-05-29T09:14:43Z">
         <w:r>
           <w:rPr>
             <w:rFonts w:cs="Arial" w:ascii="Arial" w:hAnsi="Arial"/>
@@ -1009,7 +1017,7 @@
           <w:t>207</w:t>
         </w:r>
       </w:ins>
-      <w:del w:id="7" w:author="Unknown Author" w:date="2026-05-29T09:14:41Z">
+      <w:del w:id="6" w:author="Unknown Author" w:date="2026-05-29T09:14:41Z">
         <w:r>
           <w:rPr>
             <w:rFonts w:cs="Arial" w:ascii="Arial" w:hAnsi="Arial"/>
@@ -1023,7 +1031,7 @@
         </w:rPr>
         <w:t xml:space="preserve"> lysis buffer controls (buffer), and </w:t>
       </w:r>
-      <w:ins w:id="8" w:author="Unknown Author" w:date="2026-05-29T09:16:49Z">
+      <w:ins w:id="7" w:author="Unknown Author" w:date="2026-05-29T09:16:49Z">
         <w:r>
           <w:rPr>
             <w:rFonts w:cs="Arial" w:ascii="Arial" w:hAnsi="Arial"/>
@@ -1031,7 +1039,7 @@
           <w:t>52</w:t>
         </w:r>
       </w:ins>
-      <w:del w:id="9" w:author="Unknown Author" w:date="2026-05-29T09:16:47Z">
+      <w:del w:id="8" w:author="Unknown Author" w:date="2026-05-29T09:16:40Z">
         <w:r>
           <w:rPr>
             <w:rFonts w:cs="Arial" w:ascii="Arial" w:hAnsi="Arial"/>
@@ -1039,11 +1047,9 @@
           <w:delText>11</w:delText>
         </w:r>
       </w:del>
-      <w:del w:id="10" w:author="Unknown Author" w:date="2026-05-29T09:16:40Z">
+      <w:del w:id="9" w:author="Unknown Author" w:date="2026-05-29T09:16:40Z">
         <w:r>
-          <w:rPr>
-            <w:rFonts w:cs="Arial" w:ascii="Arial" w:hAnsi="Arial"/>
-          </w:rPr>
+          <w:rPr/>
           <w:commentReference w:id="4"/>
         </w:r>
       </w:del>
@@ -1056,24 +1062,18 @@
       <w:commentRangeStart w:id="6"/>
       <w:commentRangeStart w:id="7"/>
       <w:r>
-        <w:rPr>
-          <w:rFonts w:cs="Arial" w:ascii="Arial" w:hAnsi="Arial"/>
-        </w:rPr>
+        <w:rPr/>
         <w:commentReference w:id="5"/>
       </w:r>
       <w:r>
-        <w:rPr>
-          <w:rFonts w:cs="Arial" w:ascii="Arial" w:hAnsi="Arial"/>
-        </w:rPr>
+        <w:rPr/>
       </w:r>
       <w:commentRangeEnd w:id="7"/>
       <w:r>
         <w:commentReference w:id="7"/>
       </w:r>
       <w:r>
-        <w:rPr>
-          <w:rFonts w:cs="Arial" w:ascii="Arial" w:hAnsi="Arial"/>
-        </w:rPr>
+        <w:rPr/>
       </w:r>
       <w:commentRangeEnd w:id="6"/>
       <w:r>
@@ -1085,7 +1085,7 @@
         </w:rPr>
         <w:t>, yielding an initial pool of 6,</w:t>
       </w:r>
-      <w:ins w:id="11" w:author="Unknown Author" w:date="2026-05-29T09:17:06Z">
+      <w:ins w:id="10" w:author="Unknown Author" w:date="2026-05-29T09:17:06Z">
         <w:r>
           <w:rPr>
             <w:rFonts w:cs="Arial" w:ascii="Arial" w:hAnsi="Arial"/>
@@ -1093,7 +1093,7 @@
           <w:t>017</w:t>
         </w:r>
       </w:ins>
-      <w:del w:id="12" w:author="Unknown Author" w:date="2026-05-29T09:17:03Z">
+      <w:del w:id="11" w:author="Unknown Author" w:date="2026-05-29T09:17:03Z">
         <w:r>
           <w:rPr>
             <w:rFonts w:cs="Arial" w:ascii="Arial" w:hAnsi="Arial"/>
@@ -1107,7 +1107,7 @@
         </w:rPr>
         <w:t xml:space="preserve"> taxa</w:t>
       </w:r>
-      <w:del w:id="13" w:author="Unknown Author" w:date="2026-05-29T09:20:00Z">
+      <w:del w:id="12" w:author="Unknown Author" w:date="2026-05-29T09:20:00Z">
         <w:r>
           <w:rPr>
             <w:rFonts w:cs="Arial" w:ascii="Arial" w:hAnsi="Arial"/>
@@ -1121,7 +1121,7 @@
         </w:rPr>
         <w:t>.</w:t>
       </w:r>
-      <w:del w:id="14" w:author="Unknown Author" w:date="2026-05-29T09:20:21Z">
+      <w:del w:id="13" w:author="Unknown Author" w:date="2026-05-29T09:20:21Z">
         <w:r>
           <w:rPr>
             <w:rFonts w:cs="Arial" w:ascii="Arial" w:hAnsi="Arial"/>
@@ -1129,15 +1129,13 @@
           <w:delText xml:space="preserve"> Taxa with extremely low prevalence or abundance were removed (See Methods section</w:delText>
         </w:r>
       </w:del>
-      <w:del w:id="15" w:author="Unknown Author" w:date="2026-05-29T09:20:21Z">
+      <w:del w:id="14" w:author="Unknown Author" w:date="2026-05-29T09:20:21Z">
         <w:r>
-          <w:rPr>
-            <w:rFonts w:cs="Arial" w:ascii="Arial" w:hAnsi="Arial"/>
-          </w:rPr>
+          <w:rPr/>
           <w:commentReference w:id="8"/>
         </w:r>
       </w:del>
-      <w:del w:id="16" w:author="Unknown Author" w:date="2026-05-29T09:20:21Z">
+      <w:del w:id="15" w:author="Unknown Author" w:date="2026-05-29T09:20:21Z">
         <w:r>
           <w:rPr>
             <w:rFonts w:cs="Arial" w:ascii="Arial" w:hAnsi="Arial"/>
@@ -1145,7 +1143,7 @@
           <w:delText>),</w:delText>
         </w:r>
       </w:del>
-      <w:ins w:id="17" w:author="Unknown Author" w:date="2026-05-29T09:20:28Z">
+      <w:ins w:id="16" w:author="Unknown Author" w:date="2026-05-29T09:20:28Z">
         <w:r>
           <w:rPr>
             <w:rFonts w:cs="Arial" w:ascii="Arial" w:hAnsi="Arial"/>
@@ -1153,47 +1151,23 @@
           <w:t xml:space="preserve"> </w:t>
         </w:r>
       </w:ins>
-      <w:ins w:id="18" w:author="Unknown Author" w:date="2026-05-29T09:20:28Z">
+      <w:ins w:id="17" w:author="Unknown Author" w:date="2026-06-03T12:45:42Z">
         <w:r>
           <w:rPr>
             <w:rFonts w:cs="Arial" w:ascii="Arial" w:hAnsi="Arial"/>
           </w:rPr>
-          <w:t xml:space="preserve">To reduce the noise, </w:t>
+          <w:t>To reduce noise, we applied the following filtering steps: (i) samples with fewer than 500 reads were removed from further analyses; and (ii) extremely rare taxa were excluded using the following criteria: a detection threshold of at least 2 reads per sample, presence in at least one sample, and a total abundance of at least 1 × 10⁻⁶ across all samples, corresponding to 19 reads in our dataset</w:t>
         </w:r>
       </w:ins>
-      <w:ins w:id="19" w:author="Unknown Author" w:date="2026-05-29T09:22:25Z">
+      <w:ins w:id="18" w:author="Unknown Author" w:date="2026-05-29T09:23:47Z">
         <w:r>
           <w:rPr>
             <w:rFonts w:cs="Arial" w:ascii="Arial" w:hAnsi="Arial"/>
           </w:rPr>
-          <w:t>we applied the following filtering</w:t>
+          <w:t>.</w:t>
         </w:r>
       </w:ins>
-      <w:ins w:id="20" w:author="Unknown Author" w:date="2026-05-29T09:23:47Z">
-        <w:r>
-          <w:rPr>
-            <w:rFonts w:cs="Arial" w:ascii="Arial" w:hAnsi="Arial"/>
-          </w:rPr>
-          <w:t xml:space="preserve">: </w:t>
-        </w:r>
-      </w:ins>
-      <w:ins w:id="21" w:author="Unknown Author" w:date="2026-05-29T09:23:47Z">
-        <w:r>
-          <w:rPr>
-            <w:rFonts w:cs="Arial" w:ascii="Arial" w:hAnsi="Arial"/>
-          </w:rPr>
-          <w:t xml:space="preserve">i) samples whose read number are less than 500 were removed from further analyses; ii) </w:t>
-        </w:r>
-      </w:ins>
-      <w:ins w:id="22" w:author="Unknown Author" w:date="2026-05-29T09:23:47Z">
-        <w:r>
-          <w:rPr>
-            <w:rFonts w:cs="Arial" w:ascii="Arial" w:hAnsi="Arial"/>
-          </w:rPr>
-          <w:t>to eliminate extremely rare</w:t>
-        </w:r>
-      </w:ins>
-      <w:ins w:id="23" w:author="Unknown Author" w:date="2026-05-29T09:23:47Z">
+      <w:ins w:id="19" w:author="Unknown Author" w:date="2026-05-29T09:52:00Z">
         <w:r>
           <w:rPr>
             <w:rFonts w:cs="Arial" w:ascii="Arial" w:hAnsi="Arial"/>
@@ -1201,23 +1175,7 @@
           <w:t xml:space="preserve"> </w:t>
         </w:r>
       </w:ins>
-      <w:ins w:id="24" w:author="Unknown Author" w:date="2026-05-29T09:23:47Z">
-        <w:r>
-          <w:rPr>
-            <w:rFonts w:cs="Arial" w:ascii="Arial" w:hAnsi="Arial"/>
-          </w:rPr>
-          <w:t>taxa: prevalence detection threshold for each taxa is 2 reads, taxa must happen in at least one sample, and the total abundance of taxa is at least 1e-6, or 19 reads in our setting.</w:t>
-        </w:r>
-      </w:ins>
-      <w:ins w:id="25" w:author="Unknown Author" w:date="2026-05-29T09:52:00Z">
-        <w:r>
-          <w:rPr>
-            <w:rFonts w:cs="Arial" w:ascii="Arial" w:hAnsi="Arial"/>
-          </w:rPr>
-          <w:t xml:space="preserve"> </w:t>
-        </w:r>
-      </w:ins>
-      <w:del w:id="26" w:author="Unknown Author" w:date="2026-05-29T09:42:35Z">
+      <w:del w:id="20" w:author="Unknown Author" w:date="2026-05-29T09:42:35Z">
         <w:r>
           <w:rPr>
             <w:rFonts w:cs="Arial" w:ascii="Arial" w:hAnsi="Arial"/>
@@ -1225,7 +1183,7 @@
           <w:delText xml:space="preserve"> and</w:delText>
         </w:r>
       </w:del>
-      <w:ins w:id="27" w:author="Unknown Author" w:date="2026-05-29T09:42:41Z">
+      <w:ins w:id="21" w:author="Unknown Author" w:date="2026-05-29T09:42:41Z">
         <w:r>
           <w:rPr>
             <w:rFonts w:cs="Arial" w:ascii="Arial" w:hAnsi="Arial"/>
@@ -1239,29 +1197,21 @@
         </w:rPr>
         <w:t xml:space="preserve"> samples were</w:t>
       </w:r>
-      <w:ins w:id="28" w:author="Unknown Author" w:date="2026-05-29T09:42:52Z">
+      <w:ins w:id="22" w:author="Unknown Author" w:date="2026-05-29T09:42:52Z">
         <w:r>
           <w:rPr>
             <w:rFonts w:cs="Arial" w:ascii="Arial" w:hAnsi="Arial"/>
           </w:rPr>
-          <w:t xml:space="preserve"> </w:t>
+          <w:t xml:space="preserve"> then</w:t>
         </w:r>
       </w:ins>
-      <w:ins w:id="29" w:author="Unknown Author" w:date="2026-05-29T09:42:52Z">
-        <w:r>
-          <w:rPr>
-            <w:rFonts w:cs="Arial" w:ascii="Arial" w:hAnsi="Arial"/>
-          </w:rPr>
-          <w:t>then</w:t>
-        </w:r>
-      </w:ins>
       <w:r>
         <w:rPr>
           <w:rFonts w:cs="Arial" w:ascii="Arial" w:hAnsi="Arial"/>
         </w:rPr>
         <w:t xml:space="preserve"> normalized via Wrench (8) or rarefaction (9). After filtering, 2</w:t>
       </w:r>
-      <w:ins w:id="30" w:author="Unknown Author" w:date="2026-05-29T09:52:51Z">
+      <w:ins w:id="23" w:author="Unknown Author" w:date="2026-05-29T09:52:51Z">
         <w:r>
           <w:rPr>
             <w:rFonts w:cs="Arial" w:ascii="Arial" w:hAnsi="Arial"/>
@@ -1269,7 +1219,7 @@
           <w:t>6</w:t>
         </w:r>
       </w:ins>
-      <w:ins w:id="31" w:author="Unknown Author" w:date="2026-05-29T11:14:43Z">
+      <w:ins w:id="24" w:author="Unknown Author" w:date="2026-05-29T11:14:43Z">
         <w:r>
           <w:rPr>
             <w:rFonts w:cs="Arial" w:ascii="Arial" w:hAnsi="Arial"/>
@@ -1277,7 +1227,7 @@
           <w:t>2</w:t>
         </w:r>
       </w:ins>
-      <w:del w:id="32" w:author="Unknown Author" w:date="2026-05-29T09:52:50Z">
+      <w:del w:id="25" w:author="Unknown Author" w:date="2026-05-29T09:52:50Z">
         <w:r>
           <w:rPr>
             <w:rFonts w:cs="Arial" w:ascii="Arial" w:hAnsi="Arial"/>
@@ -1291,7 +1241,7 @@
         </w:rPr>
         <w:t xml:space="preserve"> NCT samples remained: 1</w:t>
       </w:r>
-      <w:ins w:id="33" w:author="Unknown Author" w:date="2026-05-29T09:53:47Z">
+      <w:ins w:id="26" w:author="Unknown Author" w:date="2026-05-29T09:53:47Z">
         <w:r>
           <w:rPr>
             <w:rFonts w:cs="Arial" w:ascii="Arial" w:hAnsi="Arial"/>
@@ -1299,7 +1249,7 @@
           <w:t>67</w:t>
         </w:r>
       </w:ins>
-      <w:del w:id="34" w:author="Unknown Author" w:date="2026-05-29T09:53:46Z">
+      <w:del w:id="27" w:author="Unknown Author" w:date="2026-05-29T09:53:46Z">
         <w:r>
           <w:rPr>
             <w:rFonts w:cs="Arial" w:ascii="Arial" w:hAnsi="Arial"/>
@@ -1313,7 +1263,7 @@
         </w:rPr>
         <w:t xml:space="preserve"> buffer controls, </w:t>
       </w:r>
-      <w:ins w:id="35" w:author="Unknown Author" w:date="2026-05-29T09:53:57Z">
+      <w:ins w:id="28" w:author="Unknown Author" w:date="2026-05-29T09:53:57Z">
         <w:r>
           <w:rPr>
             <w:rFonts w:cs="Arial" w:ascii="Arial" w:hAnsi="Arial"/>
@@ -1321,7 +1271,7 @@
           <w:t>75</w:t>
         </w:r>
       </w:ins>
-      <w:del w:id="36" w:author="Unknown Author" w:date="2026-05-29T09:53:56Z">
+      <w:del w:id="29" w:author="Unknown Author" w:date="2026-05-29T09:53:56Z">
         <w:r>
           <w:rPr>
             <w:rFonts w:cs="Arial" w:ascii="Arial" w:hAnsi="Arial"/>
@@ -1335,7 +1285,7 @@
         </w:rPr>
         <w:t xml:space="preserve"> paraffin controls, and </w:t>
       </w:r>
-      <w:ins w:id="37" w:author="Unknown Author" w:date="2026-05-29T09:54:08Z">
+      <w:ins w:id="30" w:author="Unknown Author" w:date="2026-05-29T09:54:08Z">
         <w:r>
           <w:rPr>
             <w:rFonts w:cs="Arial" w:ascii="Arial" w:hAnsi="Arial"/>
@@ -1343,7 +1293,7 @@
           <w:t>20</w:t>
         </w:r>
       </w:ins>
-      <w:del w:id="38" w:author="Unknown Author" w:date="2026-05-29T09:54:08Z">
+      <w:del w:id="31" w:author="Unknown Author" w:date="2026-05-29T09:54:08Z">
         <w:r>
           <w:rPr>
             <w:rFonts w:cs="Arial" w:ascii="Arial" w:hAnsi="Arial"/>
@@ -1357,7 +1307,7 @@
         </w:rPr>
         <w:t xml:space="preserve"> PCR controls, encompassing </w:t>
       </w:r>
-      <w:ins w:id="39" w:author="Unknown Author" w:date="2026-05-29T09:58:24Z">
+      <w:ins w:id="32" w:author="Unknown Author" w:date="2026-05-29T09:58:24Z">
         <w:r>
           <w:rPr>
             <w:rFonts w:cs="Arial" w:ascii="Arial" w:hAnsi="Arial"/>
@@ -1365,7 +1315,7 @@
           <w:t>2,223</w:t>
         </w:r>
       </w:ins>
-      <w:del w:id="40" w:author="Unknown Author" w:date="2026-05-29T09:54:22Z">
+      <w:del w:id="33" w:author="Unknown Author" w:date="2026-05-29T09:54:22Z">
         <w:r>
           <w:rPr>
             <w:rFonts w:cs="Arial" w:ascii="Arial" w:hAnsi="Arial"/>
@@ -1379,7 +1329,7 @@
         </w:rPr>
         <w:t xml:space="preserve"> taxa after rarefaction and </w:t>
       </w:r>
-      <w:ins w:id="41" w:author="Unknown Author" w:date="2026-05-29T09:57:46Z">
+      <w:ins w:id="34" w:author="Unknown Author" w:date="2026-05-29T09:57:46Z">
         <w:r>
           <w:rPr>
             <w:rFonts w:cs="Arial" w:ascii="Arial" w:hAnsi="Arial"/>
@@ -1387,7 +1337,7 @@
           <w:t>3,028</w:t>
         </w:r>
       </w:ins>
-      <w:del w:id="42" w:author="Unknown Author" w:date="2026-05-29T09:57:45Z">
+      <w:del w:id="35" w:author="Unknown Author" w:date="2026-05-29T09:57:45Z">
         <w:r>
           <w:rPr>
             <w:rFonts w:cs="Arial" w:ascii="Arial" w:hAnsi="Arial"/>
@@ -1401,7 +1351,7 @@
         </w:rPr>
         <w:t xml:space="preserve"> taxa prior to rarefaction. These controls were accumulated between 2021 and 202</w:t>
       </w:r>
-      <w:ins w:id="43" w:author="Unknown Author" w:date="2026-05-29T09:59:19Z">
+      <w:ins w:id="36" w:author="Unknown Author" w:date="2026-05-29T09:59:19Z">
         <w:r>
           <w:rPr>
             <w:rFonts w:cs="Arial" w:ascii="Arial" w:hAnsi="Arial"/>
@@ -1409,7 +1359,7 @@
           <w:t>5</w:t>
         </w:r>
       </w:ins>
-      <w:del w:id="44" w:author="Unknown Author" w:date="2026-05-29T09:59:18Z">
+      <w:del w:id="37" w:author="Unknown Author" w:date="2026-05-29T09:59:18Z">
         <w:r>
           <w:rPr>
             <w:rFonts w:cs="Arial" w:ascii="Arial" w:hAnsi="Arial"/>
@@ -1421,9 +1371,31 @@
         <w:rPr>
           <w:rFonts w:cs="Arial" w:ascii="Arial" w:hAnsi="Arial"/>
         </w:rPr>
-        <w:t>, with a sharp expansion of paraffin and buffer control types introduced in 2022 (Table 1). Relevant batch covariates include processing laboratory persons (LP), year, and season (Figure 1.</w:t>
-      </w:r>
-      <w:ins w:id="45" w:author="Unknown Author" w:date="2026-05-29T10:14:39Z">
+        <w:t>, with a sharp expansion of paraffin and buffer control types introduced in 2022 (Table 1). Relevant batch covariates include processing laboratory person</w:t>
+      </w:r>
+      <w:ins w:id="38" w:author="Unknown Author" w:date="2026-06-03T12:48:53Z">
+        <w:r>
+          <w:rPr>
+            <w:rFonts w:cs="Arial" w:ascii="Arial" w:hAnsi="Arial"/>
+          </w:rPr>
+          <w:t>nel</w:t>
+        </w:r>
+      </w:ins>
+      <w:del w:id="39" w:author="Unknown Author" w:date="2026-06-03T12:48:52Z">
+        <w:r>
+          <w:rPr>
+            <w:rFonts w:cs="Arial" w:ascii="Arial" w:hAnsi="Arial"/>
+          </w:rPr>
+          <w:delText>s</w:delText>
+        </w:r>
+      </w:del>
+      <w:r>
+        <w:rPr>
+          <w:rFonts w:cs="Arial" w:ascii="Arial" w:hAnsi="Arial"/>
+        </w:rPr>
+        <w:t xml:space="preserve"> (LP), year, and season (Figure 1.</w:t>
+      </w:r>
+      <w:ins w:id="40" w:author="Unknown Author" w:date="2026-05-29T10:14:39Z">
         <w:r>
           <w:rPr>
             <w:rFonts w:cs="Arial" w:ascii="Arial" w:hAnsi="Arial"/>
@@ -1431,7 +1403,7 @@
           <w:t>A, lower panel</w:t>
         </w:r>
       </w:ins>
-      <w:del w:id="46" w:author="Unknown Author" w:date="2026-05-29T09:51:30Z">
+      <w:del w:id="41" w:author="Unknown Author" w:date="2026-05-29T09:51:32Z">
         <w:r>
           <w:rPr>
             <w:rFonts w:cs="Arial" w:ascii="Arial" w:hAnsi="Arial"/>
@@ -1439,15 +1411,13 @@
           <w:delText xml:space="preserve">1, lower </w:delText>
         </w:r>
       </w:del>
-      <w:del w:id="47" w:author="Unknown Author" w:date="2026-05-29T09:51:30Z">
+      <w:del w:id="42" w:author="Unknown Author" w:date="2026-05-29T09:51:32Z">
         <w:r>
-          <w:rPr>
-            <w:rFonts w:cs="Arial" w:ascii="Arial" w:hAnsi="Arial"/>
-          </w:rPr>
+          <w:rPr/>
           <w:commentReference w:id="9"/>
         </w:r>
       </w:del>
-      <w:del w:id="48" w:author="Unknown Author" w:date="2026-05-29T09:51:32Z">
+      <w:del w:id="43" w:author="Unknown Author" w:date="2026-05-29T09:51:32Z">
         <w:r>
           <w:rPr>
             <w:rFonts w:cs="Arial" w:ascii="Arial" w:hAnsi="Arial"/>
@@ -1455,18 +1425,12 @@
           <w:delText>panel</w:delText>
         </w:r>
       </w:del>
-      <w:r>
-        <w:rPr>
-          <w:rFonts w:cs="Arial" w:ascii="Arial" w:hAnsi="Arial"/>
-        </w:rPr>
-        <w:t>)</w:t>
-      </w:r>
       <w:bookmarkEnd w:id="3"/>
       <w:r>
         <w:rPr>
           <w:rFonts w:cs="Arial" w:ascii="Arial" w:hAnsi="Arial"/>
         </w:rPr>
-        <w:t>.</w:t>
+        <w:t>).</w:t>
       </w:r>
     </w:p>
     <w:p>
@@ -1494,7 +1458,7 @@
           <w:rFonts w:ascii="Arial" w:hAnsi="Arial" w:cs="Arial"/>
         </w:rPr>
       </w:pPr>
-      <w:del w:id="49" w:author="Unknown Author" w:date="2026-05-29T10:08:32Z">
+      <w:del w:id="44" w:author="Unknown Author" w:date="2026-05-29T10:08:32Z">
         <w:r>
           <w:rPr>
             <w:rFonts w:cs="Arial" w:ascii="Arial" w:hAnsi="Arial"/>
@@ -1502,12 +1466,42 @@
           <w:delText xml:space="preserve">Intra-sample </w:delText>
         </w:r>
       </w:del>
-      <w:del w:id="50" w:author="Unknown Author" w:date="2026-05-29T10:08:32Z">
+      <w:del w:id="45" w:author="Unknown Author" w:date="2026-05-29T10:08:32Z">
+        <w:r>
+          <w:rPr/>
+          <w:commentReference w:id="10"/>
+        </w:r>
+      </w:del>
+      <w:del w:id="46" w:author="Unknown Author" w:date="2026-05-29T10:08:32Z">
         <w:r>
           <w:rPr>
             <w:rFonts w:cs="Arial" w:ascii="Arial" w:hAnsi="Arial"/>
           </w:rPr>
-          <w:commentReference w:id="10"/>
+          <w:delText xml:space="preserve">and inter-sample </w:delText>
+        </w:r>
+      </w:del>
+      <w:del w:id="47" w:author="Unknown Author" w:date="2026-05-29T10:08:32Z">
+        <w:r>
+          <w:rPr/>
+          <w:commentReference w:id="11"/>
+        </w:r>
+      </w:del>
+      <w:del w:id="48" w:author="Unknown Author" w:date="2026-05-29T10:08:32Z">
+        <w:r>
+          <w:rPr/>
+          <w:commentReference w:id="12"/>
+        </w:r>
+      </w:del>
+      <w:del w:id="49" w:author="Unknown Author" w:date="2026-05-29T10:08:32Z">
+        <w:r>
+          <w:rPr/>
+          <w:commentReference w:id="13"/>
+        </w:r>
+      </w:del>
+      <w:del w:id="50" w:author="Unknown Author" w:date="2026-05-29T10:08:32Z">
+        <w:r>
+          <w:rPr/>
+          <w:commentReference w:id="14"/>
         </w:r>
       </w:del>
       <w:del w:id="51" w:author="Unknown Author" w:date="2026-05-29T10:08:32Z">
@@ -1515,50 +1509,10 @@
           <w:rPr>
             <w:rFonts w:cs="Arial" w:ascii="Arial" w:hAnsi="Arial"/>
           </w:rPr>
-          <w:delText xml:space="preserve">and inter-sample </w:delText>
-        </w:r>
-      </w:del>
-      <w:del w:id="52" w:author="Unknown Author" w:date="2026-05-29T10:08:32Z">
-        <w:r>
-          <w:rPr>
-            <w:rFonts w:cs="Arial" w:ascii="Arial" w:hAnsi="Arial"/>
-          </w:rPr>
-          <w:commentReference w:id="11"/>
-        </w:r>
-      </w:del>
-      <w:del w:id="53" w:author="Unknown Author" w:date="2026-05-29T10:08:32Z">
-        <w:r>
-          <w:rPr>
-            <w:rFonts w:cs="Arial" w:ascii="Arial" w:hAnsi="Arial"/>
-          </w:rPr>
-          <w:commentReference w:id="12"/>
-        </w:r>
-      </w:del>
-      <w:del w:id="54" w:author="Unknown Author" w:date="2026-05-29T10:08:32Z">
-        <w:r>
-          <w:rPr>
-            <w:rFonts w:cs="Arial" w:ascii="Arial" w:hAnsi="Arial"/>
-          </w:rPr>
-          <w:commentReference w:id="13"/>
-        </w:r>
-      </w:del>
-      <w:del w:id="55" w:author="Unknown Author" w:date="2026-05-29T10:08:32Z">
-        <w:r>
-          <w:rPr>
-            <w:rFonts w:cs="Arial" w:ascii="Arial" w:hAnsi="Arial"/>
-          </w:rPr>
-          <w:commentReference w:id="14"/>
-        </w:r>
-      </w:del>
-      <w:del w:id="56" w:author="Unknown Author" w:date="2026-05-29T10:08:32Z">
-        <w:r>
-          <w:rPr>
-            <w:rFonts w:cs="Arial" w:ascii="Arial" w:hAnsi="Arial"/>
-          </w:rPr>
           <w:delText>differences in microbial diversity</w:delText>
         </w:r>
       </w:del>
-      <w:ins w:id="57" w:author="Unknown Author" w:date="2026-05-29T10:08:39Z">
+      <w:ins w:id="52" w:author="Unknown Author" w:date="2026-05-29T10:08:39Z">
         <w:r>
           <w:rPr>
             <w:rFonts w:cs="Arial" w:ascii="Arial" w:hAnsi="Arial"/>
@@ -1570,22 +1524,64 @@
         <w:rPr>
           <w:rFonts w:cs="Arial" w:ascii="Arial" w:hAnsi="Arial"/>
         </w:rPr>
-        <w:t xml:space="preserve"> were observed across control types (Figures. 1.2 and 1.3). </w:t>
-      </w:r>
-      <w:commentRangeStart w:id="15"/>
-      <w:r>
-        <w:rPr>
-          <w:rFonts w:cs="Arial" w:ascii="Arial" w:hAnsi="Arial"/>
-        </w:rPr>
-        <w:t>Buffer controls exhibited significantly higher species richness and evenness compared to paraffin and PCR controls, as measured by observed species count, Shannon index, and inverse Simpson index</w:t>
-      </w:r>
-      <w:ins w:id="58" w:author="Unknown Author" w:date="2026-05-29T10:07:22Z">
+        <w:t xml:space="preserve"> were observed across control types (Figures. 1.</w:t>
+      </w:r>
+      <w:ins w:id="53" w:author="Linh Dang" w:date="2026-06-03T12:52:05Z">
         <w:r>
           <w:rPr>
             <w:rFonts w:cs="Arial" w:ascii="Arial" w:hAnsi="Arial"/>
           </w:rPr>
+          <w:t>B</w:t>
         </w:r>
       </w:ins>
+      <w:del w:id="54" w:author="Linh Dang" w:date="2026-06-03T12:52:04Z">
+        <w:r>
+          <w:rPr>
+            <w:rFonts w:cs="Arial" w:ascii="Arial" w:hAnsi="Arial"/>
+          </w:rPr>
+          <w:delText>2</w:delText>
+        </w:r>
+      </w:del>
+      <w:r>
+        <w:rPr>
+          <w:rFonts w:cs="Arial" w:ascii="Arial" w:hAnsi="Arial"/>
+        </w:rPr>
+        <w:t xml:space="preserve"> and 1.</w:t>
+      </w:r>
+      <w:ins w:id="55" w:author="Linh Dang" w:date="2026-06-03T12:52:10Z">
+        <w:r>
+          <w:rPr>
+            <w:rFonts w:cs="Arial" w:ascii="Arial" w:hAnsi="Arial"/>
+          </w:rPr>
+          <w:t>C</w:t>
+        </w:r>
+      </w:ins>
+      <w:del w:id="56" w:author="Linh Dang" w:date="2026-06-03T12:52:09Z">
+        <w:r>
+          <w:rPr>
+            <w:rFonts w:cs="Arial" w:ascii="Arial" w:hAnsi="Arial"/>
+          </w:rPr>
+          <w:delText>3</w:delText>
+        </w:r>
+      </w:del>
+      <w:r>
+        <w:rPr>
+          <w:rFonts w:cs="Arial" w:ascii="Arial" w:hAnsi="Arial"/>
+        </w:rPr>
+        <w:t xml:space="preserve">). </w:t>
+      </w:r>
+      <w:commentRangeStart w:id="15"/>
+      <w:r>
+        <w:rPr>
+          <w:rFonts w:cs="Arial" w:ascii="Arial" w:hAnsi="Arial"/>
+        </w:rPr>
+        <w:t>Buffer controls exhibited significantly higher species richness and evenness compared to paraffin and PCR controls, as measured by observed species count, Shannon index, and inverse Simpson index</w:t>
+      </w:r>
+      <w:r>
+        <w:rPr>
+          <w:rFonts w:cs="Arial" w:ascii="Arial" w:hAnsi="Arial"/>
+        </w:rPr>
+      </w:r>
       <w:commentRangeEnd w:id="15"/>
       <w:r>
         <w:commentReference w:id="15"/>
@@ -1632,7 +1628,7 @@
         <w:pStyle w:val="Compact"/>
         <w:numPr>
           <w:ilvl w:val="0"/>
-          <w:numId w:val="5"/>
+          <w:numId w:val="1"/>
         </w:numPr>
         <w:spacing w:lineRule="auto" w:line="480"/>
         <w:jc w:val="both"/>
@@ -1652,7 +1648,7 @@
         <w:pStyle w:val="Compact"/>
         <w:numPr>
           <w:ilvl w:val="0"/>
-          <w:numId w:val="6"/>
+          <w:numId w:val="4"/>
         </w:numPr>
         <w:spacing w:lineRule="auto" w:line="480"/>
         <w:jc w:val="both"/>
@@ -1798,9 +1794,7 @@
         <w:t xml:space="preserve">, were both high prevalent and high abundant in the NCTs suggesting an introduction of contamination by the LPs. </w:t>
       </w:r>
       <w:r>
-        <w:rPr>
-          <w:rFonts w:cs="Arial" w:ascii="Arial" w:hAnsi="Arial"/>
-        </w:rPr>
+        <w:rPr/>
         <w:commentReference w:id="18"/>
       </w:r>
       <w:commentRangeStart w:id="19"/>
@@ -1830,9 +1824,7 @@
         </w:rPr>
       </w:pPr>
       <w:r>
-        <w:rPr>
-          <w:rFonts w:cs="Arial" w:ascii="Arial" w:hAnsi="Arial"/>
-        </w:rPr>
+        <w:rPr/>
         <w:commentReference w:id="20"/>
       </w:r>
       <w:r>
@@ -1976,9 +1968,9 @@
         <w:tblLook w:val="0020" w:noHBand="0" w:noVBand="0" w:firstColumn="0" w:lastRow="0" w:lastColumn="0" w:firstRow="1"/>
       </w:tblPr>
       <w:tblGrid>
-        <w:gridCol w:w="1725"/>
-        <w:gridCol w:w="810"/>
-        <w:gridCol w:w="990"/>
+        <w:gridCol w:w="1724"/>
+        <w:gridCol w:w="811"/>
+        <w:gridCol w:w="989"/>
         <w:gridCol w:w="1170"/>
         <w:gridCol w:w="1080"/>
         <w:gridCol w:w="1350"/>
@@ -1990,7 +1982,7 @@
         </w:trPr>
         <w:tc>
           <w:tcPr>
-            <w:tcW w:w="1725" w:type="dxa"/>
+            <w:tcW w:w="1724" w:type="dxa"/>
             <w:tcBorders>
               <w:bottom w:val="single" w:sz="6" w:space="0" w:color="000000"/>
             </w:tcBorders>
@@ -2021,7 +2013,7 @@
         </w:tc>
         <w:tc>
           <w:tcPr>
-            <w:tcW w:w="810" w:type="dxa"/>
+            <w:tcW w:w="811" w:type="dxa"/>
             <w:tcBorders>
               <w:bottom w:val="single" w:sz="6" w:space="0" w:color="000000"/>
             </w:tcBorders>
@@ -2052,7 +2044,7 @@
         </w:tc>
         <w:tc>
           <w:tcPr>
-            <w:tcW w:w="990" w:type="dxa"/>
+            <w:tcW w:w="989" w:type="dxa"/>
             <w:tcBorders>
               <w:bottom w:val="single" w:sz="6" w:space="0" w:color="000000"/>
             </w:tcBorders>
@@ -2145,7 +2137,7 @@
         </w:tc>
         <w:tc>
           <w:tcPr>
-            <w:cellIns w:id="59" w:author="Unknown Author" w:date="2026-05-29T09:59:51Z"/>
+            <w:cellIns w:id="57" w:author="Unknown Author" w:date="2026-05-29T09:59:51Z"/>
             <w:tcW w:w="1350" w:type="dxa"/>
             <w:tcBorders>
               <w:bottom w:val="single" w:sz="6" w:space="0" w:color="000000"/>
@@ -2163,7 +2155,7 @@
                 <w:rFonts w:ascii="Arial" w:hAnsi="Arial" w:eastAsia="Aptos" w:cs="Arial"/>
               </w:rPr>
             </w:pPr>
-            <w:ins w:id="60" w:author="Unknown Author" w:date="2026-05-29T09:59:51Z">
+            <w:ins w:id="58" w:author="Unknown Author" w:date="2026-05-29T09:59:51Z">
               <w:r>
                 <w:rPr>
                   <w:rFonts w:eastAsia="Aptos" w:cs="Arial" w:ascii="Arial" w:hAnsi="Arial"/>
@@ -2175,7 +2167,7 @@
                 <w:t>‍</w:t>
               </w:r>
             </w:ins>
-            <w:ins w:id="61" w:author="Unknown Author" w:date="2026-05-29T09:59:51Z">
+            <w:ins w:id="59" w:author="Unknown Author" w:date="2026-05-29T09:59:51Z">
               <w:r>
                 <w:rPr>
                   <w:rFonts w:eastAsia="Aptos" w:cs="Arial" w:ascii="Arial" w:hAnsi="Arial"/>
@@ -2194,7 +2186,7 @@
         <w:trPr/>
         <w:tc>
           <w:tcPr>
-            <w:tcW w:w="1725" w:type="dxa"/>
+            <w:tcW w:w="1724" w:type="dxa"/>
             <w:tcBorders/>
           </w:tcPr>
           <w:p>
@@ -2222,7 +2214,7 @@
         </w:tc>
         <w:tc>
           <w:tcPr>
-            <w:tcW w:w="810" w:type="dxa"/>
+            <w:tcW w:w="811" w:type="dxa"/>
             <w:tcBorders/>
           </w:tcPr>
           <w:p>
@@ -2246,7 +2238,7 @@
               </w:rPr>
               <w:t>2</w:t>
             </w:r>
-            <w:ins w:id="62" w:author="Unknown Author" w:date="2026-05-29T10:03:40Z">
+            <w:ins w:id="60" w:author="Unknown Author" w:date="2026-05-29T10:03:40Z">
               <w:r>
                 <w:rPr>
                   <w:rFonts w:eastAsia="Aptos" w:cs="Arial" w:ascii="Arial" w:hAnsi="Arial"/>
@@ -2258,7 +2250,7 @@
                 <w:t>6</w:t>
               </w:r>
             </w:ins>
-            <w:del w:id="63" w:author="Unknown Author" w:date="2026-05-29T10:03:40Z">
+            <w:del w:id="61" w:author="Unknown Author" w:date="2026-05-29T10:03:40Z">
               <w:r>
                 <w:rPr>
                   <w:rFonts w:eastAsia="Aptos" w:cs="Arial" w:ascii="Arial" w:hAnsi="Arial"/>
@@ -2274,7 +2266,7 @@
         </w:tc>
         <w:tc>
           <w:tcPr>
-            <w:tcW w:w="990" w:type="dxa"/>
+            <w:tcW w:w="989" w:type="dxa"/>
             <w:tcBorders/>
           </w:tcPr>
           <w:p>
@@ -2298,7 +2290,7 @@
               </w:rPr>
               <w:t>6</w:t>
             </w:r>
-            <w:ins w:id="64" w:author="Unknown Author" w:date="2026-05-29T10:04:07Z">
+            <w:ins w:id="62" w:author="Unknown Author" w:date="2026-05-29T10:04:07Z">
               <w:r>
                 <w:rPr>
                   <w:rFonts w:eastAsia="Aptos" w:cs="Arial" w:ascii="Arial" w:hAnsi="Arial"/>
@@ -2310,7 +2302,7 @@
                 <w:t>7</w:t>
               </w:r>
             </w:ins>
-            <w:del w:id="65" w:author="Unknown Author" w:date="2026-05-29T10:04:06Z">
+            <w:del w:id="63" w:author="Unknown Author" w:date="2026-05-29T10:04:06Z">
               <w:r>
                 <w:rPr>
                   <w:rFonts w:eastAsia="Aptos" w:cs="Arial" w:ascii="Arial" w:hAnsi="Arial"/>
@@ -2340,7 +2332,7 @@
                 <w:rFonts w:ascii="Arial" w:hAnsi="Arial" w:eastAsia="Aptos" w:cs="Arial"/>
               </w:rPr>
             </w:pPr>
-            <w:ins w:id="66" w:author="Unknown Author" w:date="2026-05-29T10:04:30Z">
+            <w:ins w:id="64" w:author="Unknown Author" w:date="2026-05-29T10:04:30Z">
               <w:r>
                 <w:rPr>
                   <w:rFonts w:eastAsia="Aptos" w:cs="Arial" w:ascii="Arial" w:hAnsi="Arial"/>
@@ -2352,7 +2344,7 @@
                 <w:t>17</w:t>
               </w:r>
             </w:ins>
-            <w:del w:id="67" w:author="Unknown Author" w:date="2026-05-29T10:04:30Z">
+            <w:del w:id="65" w:author="Unknown Author" w:date="2026-05-29T10:04:30Z">
               <w:r>
                 <w:rPr>
                   <w:rFonts w:eastAsia="Aptos" w:cs="Arial" w:ascii="Arial" w:hAnsi="Arial"/>
@@ -2382,7 +2374,7 @@
                 <w:rFonts w:ascii="Arial" w:hAnsi="Arial" w:eastAsia="Aptos" w:cs="Arial"/>
               </w:rPr>
             </w:pPr>
-            <w:ins w:id="68" w:author="Unknown Author" w:date="2026-05-29T10:04:57Z">
+            <w:ins w:id="66" w:author="Unknown Author" w:date="2026-05-29T10:04:57Z">
               <w:r>
                 <w:rPr>
                   <w:rFonts w:eastAsia="Aptos" w:cs="Arial" w:ascii="Arial" w:hAnsi="Arial"/>
@@ -2394,7 +2386,7 @@
                 <w:t>38</w:t>
               </w:r>
             </w:ins>
-            <w:del w:id="69" w:author="Unknown Author" w:date="2026-05-29T10:04:56Z">
+            <w:del w:id="67" w:author="Unknown Author" w:date="2026-05-29T10:04:56Z">
               <w:r>
                 <w:rPr>
                   <w:rFonts w:eastAsia="Aptos" w:cs="Arial" w:ascii="Arial" w:hAnsi="Arial"/>
@@ -2410,7 +2402,7 @@
         </w:tc>
         <w:tc>
           <w:tcPr>
-            <w:cellIns w:id="70" w:author="Unknown Author" w:date="2026-05-29T09:59:51Z"/>
+            <w:cellIns w:id="68" w:author="Unknown Author" w:date="2026-05-29T09:59:51Z"/>
             <w:tcW w:w="1350" w:type="dxa"/>
             <w:tcBorders/>
           </w:tcPr>
@@ -2425,7 +2417,7 @@
                 <w:rFonts w:ascii="Arial" w:hAnsi="Arial" w:eastAsia="Aptos" w:cs="Arial"/>
               </w:rPr>
             </w:pPr>
-            <w:ins w:id="71" w:author="Unknown Author" w:date="2026-05-29T09:59:51Z">
+            <w:ins w:id="69" w:author="Unknown Author" w:date="2026-05-29T09:59:51Z">
               <w:r>
                 <w:rPr>
                   <w:rFonts w:eastAsia="Aptos" w:cs="Arial" w:ascii="Arial" w:hAnsi="Arial"/>
@@ -2437,7 +2429,7 @@
                 <w:t>‍</w:t>
               </w:r>
             </w:ins>
-            <w:ins w:id="72" w:author="Unknown Author" w:date="2026-05-29T10:03:06Z">
+            <w:ins w:id="70" w:author="Unknown Author" w:date="2026-05-29T10:03:06Z">
               <w:r>
                 <w:rPr>
                   <w:rFonts w:eastAsia="Aptos" w:cs="Arial" w:ascii="Arial" w:hAnsi="Arial"/>
@@ -2456,7 +2448,7 @@
         <w:trPr/>
         <w:tc>
           <w:tcPr>
-            <w:tcW w:w="1725" w:type="dxa"/>
+            <w:tcW w:w="1724" w:type="dxa"/>
             <w:tcBorders/>
           </w:tcPr>
           <w:p>
@@ -2484,7 +2476,7 @@
         </w:tc>
         <w:tc>
           <w:tcPr>
-            <w:tcW w:w="810" w:type="dxa"/>
+            <w:tcW w:w="811" w:type="dxa"/>
             <w:tcBorders/>
           </w:tcPr>
           <w:p>
@@ -2498,7 +2490,7 @@
                 <w:rFonts w:ascii="Arial" w:hAnsi="Arial" w:eastAsia="Aptos" w:cs="Arial"/>
               </w:rPr>
             </w:pPr>
-            <w:ins w:id="73" w:author="Unknown Author" w:date="2026-05-29T10:03:44Z">
+            <w:ins w:id="71" w:author="Unknown Author" w:date="2026-05-29T10:03:44Z">
               <w:r>
                 <w:rPr>
                   <w:rFonts w:eastAsia="Aptos" w:cs="Arial" w:ascii="Arial" w:hAnsi="Arial"/>
@@ -2510,7 +2502,7 @@
                 <w:t>2</w:t>
               </w:r>
             </w:ins>
-            <w:del w:id="74" w:author="Unknown Author" w:date="2026-05-29T10:03:44Z">
+            <w:del w:id="72" w:author="Unknown Author" w:date="2026-05-29T10:03:44Z">
               <w:r>
                 <w:rPr>
                   <w:rFonts w:eastAsia="Aptos" w:cs="Arial" w:ascii="Arial" w:hAnsi="Arial"/>
@@ -2526,7 +2518,7 @@
         </w:tc>
         <w:tc>
           <w:tcPr>
-            <w:tcW w:w="990" w:type="dxa"/>
+            <w:tcW w:w="989" w:type="dxa"/>
             <w:tcBorders/>
           </w:tcPr>
           <w:p>
@@ -2550,7 +2542,7 @@
               </w:rPr>
               <w:t>5</w:t>
             </w:r>
-            <w:ins w:id="75" w:author="Unknown Author" w:date="2026-05-29T10:04:11Z">
+            <w:ins w:id="73" w:author="Unknown Author" w:date="2026-05-29T10:04:11Z">
               <w:r>
                 <w:rPr>
                   <w:rFonts w:eastAsia="Aptos" w:cs="Arial" w:ascii="Arial" w:hAnsi="Arial"/>
@@ -2562,7 +2554,7 @@
                 <w:t>6</w:t>
               </w:r>
             </w:ins>
-            <w:del w:id="76" w:author="Unknown Author" w:date="2026-05-29T10:04:11Z">
+            <w:del w:id="74" w:author="Unknown Author" w:date="2026-05-29T10:04:11Z">
               <w:r>
                 <w:rPr>
                   <w:rFonts w:eastAsia="Aptos" w:cs="Arial" w:ascii="Arial" w:hAnsi="Arial"/>
@@ -2592,7 +2584,7 @@
                 <w:rFonts w:ascii="Arial" w:hAnsi="Arial" w:eastAsia="Aptos" w:cs="Arial"/>
               </w:rPr>
             </w:pPr>
-            <w:ins w:id="77" w:author="Unknown Author" w:date="2026-05-29T10:04:35Z">
+            <w:ins w:id="75" w:author="Unknown Author" w:date="2026-05-29T10:04:35Z">
               <w:r>
                 <w:rPr>
                   <w:rFonts w:eastAsia="Aptos" w:cs="Arial" w:ascii="Arial" w:hAnsi="Arial"/>
@@ -2604,7 +2596,7 @@
                 <w:t>9</w:t>
               </w:r>
             </w:ins>
-            <w:del w:id="78" w:author="Unknown Author" w:date="2026-05-29T10:04:34Z">
+            <w:del w:id="76" w:author="Unknown Author" w:date="2026-05-29T10:04:34Z">
               <w:r>
                 <w:rPr>
                   <w:rFonts w:eastAsia="Aptos" w:cs="Arial" w:ascii="Arial" w:hAnsi="Arial"/>
@@ -2644,7 +2636,7 @@
               </w:rPr>
               <w:t>1</w:t>
             </w:r>
-            <w:del w:id="79" w:author="Unknown Author" w:date="2026-05-29T10:05:01Z">
+            <w:del w:id="77" w:author="Unknown Author" w:date="2026-05-29T10:05:01Z">
               <w:r>
                 <w:rPr>
                   <w:rFonts w:eastAsia="Aptos" w:cs="Arial" w:ascii="Arial" w:hAnsi="Arial"/>
@@ -2660,7 +2652,7 @@
         </w:tc>
         <w:tc>
           <w:tcPr>
-            <w:cellIns w:id="80" w:author="Unknown Author" w:date="2026-05-29T09:59:51Z"/>
+            <w:cellIns w:id="78" w:author="Unknown Author" w:date="2026-05-29T09:59:51Z"/>
             <w:tcW w:w="1350" w:type="dxa"/>
             <w:tcBorders/>
           </w:tcPr>
@@ -2675,7 +2667,7 @@
                 <w:rFonts w:ascii="Arial" w:hAnsi="Arial" w:eastAsia="Aptos" w:cs="Arial"/>
               </w:rPr>
             </w:pPr>
-            <w:ins w:id="81" w:author="Unknown Author" w:date="2026-05-29T09:59:51Z">
+            <w:ins w:id="79" w:author="Unknown Author" w:date="2026-05-29T09:59:51Z">
               <w:r>
                 <w:rPr>
                   <w:rFonts w:eastAsia="Aptos" w:cs="Arial" w:ascii="Arial" w:hAnsi="Arial"/>
@@ -2687,7 +2679,7 @@
                 <w:t>‍</w:t>
               </w:r>
             </w:ins>
-            <w:ins w:id="82" w:author="Unknown Author" w:date="2026-05-29T10:03:14Z">
+            <w:ins w:id="80" w:author="Unknown Author" w:date="2026-05-29T10:03:14Z">
               <w:r>
                 <w:rPr>
                   <w:rFonts w:eastAsia="Aptos" w:cs="Arial" w:ascii="Arial" w:hAnsi="Arial"/>
@@ -2706,7 +2698,7 @@
         <w:trPr/>
         <w:tc>
           <w:tcPr>
-            <w:tcW w:w="1725" w:type="dxa"/>
+            <w:tcW w:w="1724" w:type="dxa"/>
             <w:tcBorders/>
           </w:tcPr>
           <w:p>
@@ -2734,7 +2726,7 @@
         </w:tc>
         <w:tc>
           <w:tcPr>
-            <w:tcW w:w="810" w:type="dxa"/>
+            <w:tcW w:w="811" w:type="dxa"/>
             <w:tcBorders/>
           </w:tcPr>
           <w:p>
@@ -2762,7 +2754,7 @@
         </w:tc>
         <w:tc>
           <w:tcPr>
-            <w:tcW w:w="990" w:type="dxa"/>
+            <w:tcW w:w="989" w:type="dxa"/>
             <w:tcBorders/>
           </w:tcPr>
           <w:p>
@@ -2776,7 +2768,7 @@
                 <w:rFonts w:ascii="Arial" w:hAnsi="Arial" w:eastAsia="Aptos" w:cs="Arial"/>
               </w:rPr>
             </w:pPr>
-            <w:ins w:id="83" w:author="Unknown Author" w:date="2026-05-29T10:04:16Z">
+            <w:ins w:id="81" w:author="Unknown Author" w:date="2026-05-29T10:04:16Z">
               <w:r>
                 <w:rPr>
                   <w:rFonts w:eastAsia="Aptos" w:cs="Arial" w:ascii="Arial" w:hAnsi="Arial"/>
@@ -2788,7 +2780,7 @@
                 <w:t>4</w:t>
               </w:r>
             </w:ins>
-            <w:del w:id="84" w:author="Unknown Author" w:date="2026-05-29T10:04:15Z">
+            <w:del w:id="82" w:author="Unknown Author" w:date="2026-05-29T10:04:15Z">
               <w:r>
                 <w:rPr>
                   <w:rFonts w:eastAsia="Aptos" w:cs="Arial" w:ascii="Arial" w:hAnsi="Arial"/>
@@ -2818,7 +2810,7 @@
                 <w:rFonts w:ascii="Arial" w:hAnsi="Arial" w:eastAsia="Aptos" w:cs="Arial"/>
               </w:rPr>
             </w:pPr>
-            <w:ins w:id="85" w:author="Unknown Author" w:date="2026-05-29T10:04:40Z">
+            <w:ins w:id="83" w:author="Unknown Author" w:date="2026-05-29T10:04:40Z">
               <w:r>
                 <w:rPr>
                   <w:rFonts w:eastAsia="Aptos" w:cs="Arial" w:ascii="Arial" w:hAnsi="Arial"/>
@@ -2830,7 +2822,7 @@
                 <w:t>4</w:t>
               </w:r>
             </w:ins>
-            <w:del w:id="86" w:author="Unknown Author" w:date="2026-05-29T10:04:40Z">
+            <w:del w:id="84" w:author="Unknown Author" w:date="2026-05-29T10:04:40Z">
               <w:r>
                 <w:rPr>
                   <w:rFonts w:eastAsia="Aptos" w:cs="Arial" w:ascii="Arial" w:hAnsi="Arial"/>
@@ -2860,7 +2852,7 @@
                 <w:rFonts w:ascii="Arial" w:hAnsi="Arial" w:eastAsia="Aptos" w:cs="Arial"/>
               </w:rPr>
             </w:pPr>
-            <w:ins w:id="87" w:author="Unknown Author" w:date="2026-05-29T10:05:05Z">
+            <w:ins w:id="85" w:author="Unknown Author" w:date="2026-05-29T10:05:05Z">
               <w:r>
                 <w:rPr>
                   <w:rFonts w:eastAsia="Aptos" w:cs="Arial" w:ascii="Arial" w:hAnsi="Arial"/>
@@ -2872,7 +2864,7 @@
                 <w:t>8</w:t>
               </w:r>
             </w:ins>
-            <w:del w:id="88" w:author="Unknown Author" w:date="2026-05-29T10:05:05Z">
+            <w:del w:id="86" w:author="Unknown Author" w:date="2026-05-29T10:05:05Z">
               <w:r>
                 <w:rPr>
                   <w:rFonts w:eastAsia="Aptos" w:cs="Arial" w:ascii="Arial" w:hAnsi="Arial"/>
@@ -2888,7 +2880,7 @@
         </w:tc>
         <w:tc>
           <w:tcPr>
-            <w:cellIns w:id="89" w:author="Unknown Author" w:date="2026-05-29T09:59:51Z"/>
+            <w:cellIns w:id="87" w:author="Unknown Author" w:date="2026-05-29T09:59:51Z"/>
             <w:tcW w:w="1350" w:type="dxa"/>
             <w:tcBorders/>
           </w:tcPr>
@@ -2903,7 +2895,7 @@
                 <w:rFonts w:ascii="Arial" w:hAnsi="Arial" w:eastAsia="Aptos" w:cs="Arial"/>
               </w:rPr>
             </w:pPr>
-            <w:ins w:id="90" w:author="Unknown Author" w:date="2026-05-29T09:59:51Z">
+            <w:ins w:id="88" w:author="Unknown Author" w:date="2026-05-29T09:59:51Z">
               <w:r>
                 <w:rPr>
                   <w:rFonts w:eastAsia="Aptos" w:cs="Arial" w:ascii="Arial" w:hAnsi="Arial"/>
@@ -2915,7 +2907,7 @@
                 <w:t>‍</w:t>
               </w:r>
             </w:ins>
-            <w:ins w:id="91" w:author="Unknown Author" w:date="2026-05-29T10:03:18Z">
+            <w:ins w:id="89" w:author="Unknown Author" w:date="2026-05-29T10:03:18Z">
               <w:r>
                 <w:rPr>
                   <w:rFonts w:eastAsia="Aptos" w:cs="Arial" w:ascii="Arial" w:hAnsi="Arial"/>
@@ -2940,8 +2932,8 @@
           <w:rFonts w:ascii="Arial" w:hAnsi="Arial" w:cs="Arial"/>
         </w:rPr>
       </w:pPr>
-      <w:bookmarkStart w:id="5" w:name="X6cee09c5ac2a1546c7829ea28769976f6c93ddd"/>
-      <w:bookmarkStart w:id="6" w:name="contamination-survey-in-the-laboratory"/>
+      <w:bookmarkStart w:id="5" w:name="contamination-survey-in-the-laboratory"/>
+      <w:bookmarkStart w:id="6" w:name="X6cee09c5ac2a1546c7829ea28769976f6c93ddd"/>
       <w:r>
         <w:rPr/>
         <mc:AlternateContent>
@@ -2950,15 +2942,11 @@
               <wp:inline distT="0" distB="0" distL="0" distR="0">
                 <wp:extent cx="635" cy="19050"/>
                 <wp:effectExtent l="114300" t="0" r="114300" b="0"/>
-                <wp:docPr id="3" name="Rechteck 3"/>
+                <wp:docPr id="2" name="Rechteck 3"/>
                 <a:graphic xmlns:a="http://schemas.openxmlformats.org/drawingml/2006/main">
                   <a:graphicData uri="http://schemas.microsoft.com/office/word/2010/wordprocessingShape">
                     <wps:wsp>
                       <wps:cNvSpPr/>
-                      <wps:nvSpPr>
-                        <wps:cNvPr id="4" name="Rechteck 3"/>
-                        <wps:cNvSpPr/>
-                      </wps:nvSpPr>
                       <wps:spPr>
                         <a:xfrm>
                           <a:off x="0" y="0"/>
@@ -2976,6 +2964,12 @@
                           </a:solidFill>
                         </a:ln>
                       </wps:spPr>
+                      <wps:style>
+                        <a:lnRef idx="0"/>
+                        <a:fillRef idx="0"/>
+                        <a:effectRef idx="0"/>
+                        <a:fontRef idx="minor"/>
+                      </wps:style>
                       <wps:bodyPr/>
                     </wps:wsp>
                   </a:graphicData>
@@ -2985,10 +2979,10 @@
           </mc:Choice>
           <mc:Fallback>
             <w:pict>
-              <v:rect id="shape_0" ID="Rechteck 3" fillcolor="white" stroked="t" o:allowincell="f" style="position:absolute;margin-left:0pt;margin-top:-1.55pt;width:0pt;height:1.45pt;mso-wrap-style:none;v-text-anchor:middle;mso-position-vertical:top">
+              <v:rect id="shape_0" ID="Rechteck 3" path="m0,0l-2147483645,0l-2147483645,-2147483646l0,-2147483646xe" fillcolor="white" stroked="t" o:allowincell="f" style="position:absolute;margin-left:0pt;margin-top:-1.55pt;width:0pt;height:1.45pt;mso-wrap-style:none;v-text-anchor:middle;mso-position-vertical:top">
                 <v:fill o:detectmouseclick="t" type="solid" color2="black"/>
                 <v:stroke color="black" joinstyle="round" endcap="flat"/>
-                <w10:wrap type="none"/>
+                <w10:wrap type="square"/>
               </v:rect>
             </w:pict>
           </mc:Fallback>
@@ -3063,18 +3057,18 @@
           <w:rFonts w:cs="Arial" w:ascii="Arial" w:hAnsi="Arial"/>
         </w:rPr>
       </w:r>
+      <w:commentRangeEnd w:id="25"/>
+      <w:r>
+        <w:commentReference w:id="25"/>
+      </w:r>
+      <w:r>
+        <w:rPr>
+          <w:rFonts w:cs="Arial" w:ascii="Arial" w:hAnsi="Arial"/>
+        </w:rPr>
+      </w:r>
       <w:commentRangeEnd w:id="24"/>
       <w:r>
         <w:commentReference w:id="24"/>
-      </w:r>
-      <w:r>
-        <w:rPr>
-          <w:rFonts w:cs="Arial" w:ascii="Arial" w:hAnsi="Arial"/>
-        </w:rPr>
-      </w:r>
-      <w:commentRangeEnd w:id="25"/>
-      <w:r>
-        <w:commentReference w:id="25"/>
       </w:r>
       <w:r>
         <w:rPr>
@@ -3346,15 +3340,11 @@
               <wp:inline distT="0" distB="0" distL="0" distR="0">
                 <wp:extent cx="5943600" cy="19050"/>
                 <wp:effectExtent l="114300" t="0" r="114300" b="0"/>
-                <wp:docPr id="5" name="Rechteck 5"/>
+                <wp:docPr id="3" name="Rechteck 5"/>
                 <a:graphic xmlns:a="http://schemas.openxmlformats.org/drawingml/2006/main">
                   <a:graphicData uri="http://schemas.microsoft.com/office/word/2010/wordprocessingShape">
                     <wps:wsp>
                       <wps:cNvSpPr/>
-                      <wps:nvSpPr>
-                        <wps:cNvPr id="6" name="Rechteck 5"/>
-                        <wps:cNvSpPr/>
-                      </wps:nvSpPr>
                       <wps:spPr>
                         <a:xfrm>
                           <a:off x="0" y="0"/>
@@ -3372,6 +3362,12 @@
                           </a:solidFill>
                         </a:ln>
                       </wps:spPr>
+                      <wps:style>
+                        <a:lnRef idx="0"/>
+                        <a:fillRef idx="0"/>
+                        <a:effectRef idx="0"/>
+                        <a:fontRef idx="minor"/>
+                      </wps:style>
                       <wps:bodyPr/>
                     </wps:wsp>
                   </a:graphicData>
@@ -3381,10 +3377,10 @@
           </mc:Choice>
           <mc:Fallback>
             <w:pict>
-              <v:rect id="shape_0" ID="Rechteck 5" fillcolor="white" stroked="t" o:allowincell="f" style="position:absolute;margin-left:0pt;margin-top:-1.55pt;width:467.95pt;height:1.45pt;mso-wrap-style:none;v-text-anchor:middle;mso-position-vertical:top">
+              <v:rect id="shape_0" ID="Rechteck 5" path="m0,0l-2147483645,0l-2147483645,-2147483646l0,-2147483646xe" fillcolor="white" stroked="t" o:allowincell="f" style="position:absolute;margin-left:0pt;margin-top:-1.55pt;width:467.95pt;height:1.45pt;mso-wrap-style:none;v-text-anchor:middle;mso-position-vertical:top">
                 <v:fill o:detectmouseclick="t" type="solid" color2="black"/>
                 <v:stroke color="black" joinstyle="round" endcap="flat"/>
-                <w10:wrap type="none"/>
+                <w10:wrap type="square"/>
               </v:rect>
             </w:pict>
           </mc:Fallback>
@@ -3510,15 +3506,11 @@
         </w:rPr>
       </w:pPr>
       <w:r>
-        <w:rPr>
-          <w:rFonts w:cs="Arial" w:ascii="Arial" w:hAnsi="Arial"/>
-        </w:rPr>
+        <w:rPr/>
         <w:commentReference w:id="36"/>
       </w:r>
       <w:r>
-        <w:rPr>
-          <w:rFonts w:cs="Arial" w:ascii="Arial" w:hAnsi="Arial"/>
-        </w:rPr>
+        <w:rPr/>
         <w:commentReference w:id="37"/>
       </w:r>
       <w:r>
@@ -3589,6 +3581,7 @@
         </w:rPr>
         <w:t xml:space="preserve">). </w:t>
       </w:r>
+      <w:bookmarkEnd w:id="8"/>
       <w:commentRangeStart w:id="41"/>
       <w:r>
         <w:rPr>
@@ -3604,7 +3597,6 @@
           <w:rFonts w:cs="Arial" w:ascii="Arial" w:hAnsi="Arial"/>
         </w:rPr>
       </w:r>
-      <w:bookmarkEnd w:id="8"/>
       <w:commentRangeEnd w:id="41"/>
       <w:r>
         <w:commentReference w:id="41"/>
@@ -3774,8 +3766,8 @@
         <w:tblLook w:val="0020" w:noHBand="0" w:noVBand="0" w:firstColumn="0" w:lastRow="0" w:lastColumn="0" w:firstRow="1"/>
       </w:tblPr>
       <w:tblGrid>
-        <w:gridCol w:w="1524"/>
-        <w:gridCol w:w="1662"/>
+        <w:gridCol w:w="1523"/>
+        <w:gridCol w:w="1663"/>
         <w:gridCol w:w="2015"/>
         <w:gridCol w:w="1688"/>
         <w:gridCol w:w="1170"/>
@@ -3788,7 +3780,7 @@
         </w:trPr>
         <w:tc>
           <w:tcPr>
-            <w:tcW w:w="1524" w:type="dxa"/>
+            <w:tcW w:w="1523" w:type="dxa"/>
             <w:tcBorders>
               <w:bottom w:val="single" w:sz="6" w:space="0" w:color="000000"/>
             </w:tcBorders>
@@ -3814,13 +3806,13 @@
                 <w:szCs w:val="24"/>
                 <w:lang w:val="en-US" w:eastAsia="en-US" w:bidi="ar-SA"/>
               </w:rPr>
-              <w:t xml:space="preserve">Methods  </w:t>
+              <w:t>Methods</w:t>
             </w:r>
           </w:p>
         </w:tc>
         <w:tc>
           <w:tcPr>
-            <w:tcW w:w="1662" w:type="dxa"/>
+            <w:tcW w:w="1663" w:type="dxa"/>
             <w:tcBorders>
               <w:bottom w:val="single" w:sz="6" w:space="0" w:color="000000"/>
             </w:tcBorders>
@@ -4007,7 +3999,7 @@
         <w:trPr/>
         <w:tc>
           <w:tcPr>
-            <w:tcW w:w="1524" w:type="dxa"/>
+            <w:tcW w:w="1523" w:type="dxa"/>
             <w:tcBorders/>
           </w:tcPr>
           <w:p>
@@ -4035,7 +4027,7 @@
         </w:tc>
         <w:tc>
           <w:tcPr>
-            <w:tcW w:w="1662" w:type="dxa"/>
+            <w:tcW w:w="1663" w:type="dxa"/>
             <w:tcBorders/>
           </w:tcPr>
           <w:p>
@@ -4178,7 +4170,7 @@
         <w:trPr/>
         <w:tc>
           <w:tcPr>
-            <w:tcW w:w="1524" w:type="dxa"/>
+            <w:tcW w:w="1523" w:type="dxa"/>
             <w:tcBorders/>
           </w:tcPr>
           <w:p>
@@ -4206,7 +4198,7 @@
         </w:tc>
         <w:tc>
           <w:tcPr>
-            <w:tcW w:w="1662" w:type="dxa"/>
+            <w:tcW w:w="1663" w:type="dxa"/>
             <w:tcBorders/>
           </w:tcPr>
           <w:p>
@@ -4349,7 +4341,7 @@
         <w:trPr/>
         <w:tc>
           <w:tcPr>
-            <w:tcW w:w="1524" w:type="dxa"/>
+            <w:tcW w:w="1523" w:type="dxa"/>
             <w:tcBorders/>
           </w:tcPr>
           <w:p>
@@ -4377,7 +4369,7 @@
         </w:tc>
         <w:tc>
           <w:tcPr>
-            <w:tcW w:w="1662" w:type="dxa"/>
+            <w:tcW w:w="1663" w:type="dxa"/>
             <w:tcBorders/>
           </w:tcPr>
           <w:p>
@@ -4520,7 +4512,7 @@
         <w:trPr/>
         <w:tc>
           <w:tcPr>
-            <w:tcW w:w="1524" w:type="dxa"/>
+            <w:tcW w:w="1523" w:type="dxa"/>
             <w:tcBorders/>
           </w:tcPr>
           <w:p>
@@ -4548,7 +4540,7 @@
         </w:tc>
         <w:tc>
           <w:tcPr>
-            <w:tcW w:w="1662" w:type="dxa"/>
+            <w:tcW w:w="1663" w:type="dxa"/>
             <w:tcBorders/>
           </w:tcPr>
           <w:p>
@@ -4691,7 +4683,7 @@
         <w:trPr/>
         <w:tc>
           <w:tcPr>
-            <w:tcW w:w="1524" w:type="dxa"/>
+            <w:tcW w:w="1523" w:type="dxa"/>
             <w:tcBorders/>
           </w:tcPr>
           <w:p>
@@ -4719,7 +4711,7 @@
         </w:tc>
         <w:tc>
           <w:tcPr>
-            <w:tcW w:w="1662" w:type="dxa"/>
+            <w:tcW w:w="1663" w:type="dxa"/>
             <w:tcBorders/>
           </w:tcPr>
           <w:p>
@@ -4855,8 +4847,8 @@
               </w:rPr>
               <w:t>0.641</w:t>
             </w:r>
-            <w:bookmarkStart w:id="9" w:name="assessment-using-technical-replicates"/>
-            <w:bookmarkStart w:id="10" w:name="benchmarking-of-decontamination-methods"/>
+            <w:bookmarkStart w:id="9" w:name="benchmarking-of-decontamination-methods"/>
+            <w:bookmarkStart w:id="10" w:name="assessment-using-technical-replicates"/>
             <w:bookmarkEnd w:id="9"/>
             <w:bookmarkEnd w:id="10"/>
           </w:p>
@@ -5167,14 +5159,14 @@
         <w:rPr>
           <w:rFonts w:cs="Arial" w:ascii="Arial" w:hAnsi="Arial"/>
         </w:rPr>
-        <w:t>genome of 13550 bacterial taxa, latest updated on December 2024</w:t>
+        <w:t>genome of 13550 bacterial taxa, latest updated on December 202</w:t>
       </w:r>
       <w:bookmarkEnd w:id="12"/>
       <w:r>
         <w:rPr>
           <w:rFonts w:cs="Arial" w:ascii="Arial" w:hAnsi="Arial"/>
         </w:rPr>
-        <w:t>.</w:t>
+        <w:t>4.</w:t>
       </w:r>
     </w:p>
     <w:p>
@@ -5474,14 +5466,14 @@
         <w:rPr>
           <w:rFonts w:cs="Arial" w:ascii="Arial" w:hAnsi="Arial"/>
         </w:rPr>
-        <w:t xml:space="preserve"> and Wrench method in R package (8) for normalization</w:t>
+        <w:t xml:space="preserve"> and Wrench method in R package (8) for normalizatio</w:t>
       </w:r>
       <w:bookmarkEnd w:id="14"/>
       <w:r>
         <w:rPr>
           <w:rFonts w:cs="Arial" w:ascii="Arial" w:hAnsi="Arial"/>
         </w:rPr>
-        <w:t>.</w:t>
+        <w:t>n.</w:t>
       </w:r>
     </w:p>
     <w:p>
@@ -5623,12 +5615,12 @@
         </w:rPr>
         <w:t>NCT samples were excluded from further analyses; (2) Decontam (6): probability-based classification of contaminant taxa using negative control prevalence; (3) SCRuB (2): source tracking-based contaminant removal; and (4) Nejman et. al. procedure (7): the decontamination strategy incorporating multiple filtering criteria. Notbly, instead of binomial testing as Nejman et al. described in (7), we applied Fisher test instead due to small number of samples and negative controls. The implementation of those four decontamination methods is available in the github repository</w:t>
       </w:r>
-      <w:r>
-        <w:rPr>
-          <w:rFonts w:cs="Arial" w:ascii="Arial" w:hAnsi="Arial"/>
-        </w:rPr>
-      </w:r>
       <w:bookmarkEnd w:id="17"/>
+      <w:r>
+        <w:rPr>
+          <w:rFonts w:cs="Arial" w:ascii="Arial" w:hAnsi="Arial"/>
+        </w:rPr>
+      </w:r>
       <w:commentRangeEnd w:id="49"/>
       <w:r>
         <w:commentReference w:id="49"/>
@@ -5665,8 +5657,8 @@
           <w:rFonts w:ascii="Arial" w:hAnsi="Arial" w:cs="Arial"/>
         </w:rPr>
       </w:pPr>
-      <w:bookmarkStart w:id="18" w:name="materials-and-methods"/>
-      <w:bookmarkStart w:id="19" w:name="composite-score"/>
+      <w:bookmarkStart w:id="18" w:name="composite-score"/>
+      <w:bookmarkStart w:id="19" w:name="materials-and-methods"/>
       <w:r>
         <w:rPr>
           <w:rFonts w:cs="Arial" w:ascii="Arial" w:hAnsi="Arial"/>
@@ -6493,7 +6485,7 @@
   <w:comment w:id="0" w:author="Christoph Ammer-Herrmenau" w:date="2026-04-13T22:16:00Z" w:initials="CA">
     <w:p>
       <w:pPr>
-        <w:overflowPunct w:val="false"/>
+        <w:overflowPunct w:val="true"/>
         <w:spacing w:before="0" w:after="0"/>
         <w:rPr/>
       </w:pPr>
@@ -6511,7 +6503,7 @@
   <w:comment w:id="1" w:author="Christoph Ammer-Herrmenau" w:date="2026-04-13T22:16:00Z" w:initials="CA">
     <w:p>
       <w:pPr>
-        <w:overflowPunct w:val="false"/>
+        <w:overflowPunct w:val="true"/>
         <w:spacing w:before="0" w:after="0"/>
         <w:rPr/>
       </w:pPr>
@@ -6527,7 +6519,7 @@
   <w:comment w:id="2" w:author="Christoph Ammer-Herrmenau" w:date="2026-04-13T22:19:00Z" w:initials="CA">
     <w:p>
       <w:pPr>
-        <w:overflowPunct w:val="false"/>
+        <w:overflowPunct w:val="true"/>
         <w:spacing w:before="0" w:after="0"/>
         <w:rPr/>
       </w:pPr>
@@ -6543,7 +6535,7 @@
   <w:comment w:id="3" w:author="Christoph Ammer-Herrmenau" w:date="2026-04-22T21:34:00Z" w:initials="CA">
     <w:p>
       <w:pPr>
-        <w:overflowPunct w:val="false"/>
+        <w:overflowPunct w:val="true"/>
         <w:spacing w:before="0" w:after="0"/>
         <w:rPr/>
       </w:pPr>
@@ -6559,7 +6551,7 @@
   <w:comment w:id="4" w:author="Christoph Ammer-Herrmenau" w:date="2026-04-22T21:53:00Z" w:initials="CA">
     <w:p>
       <w:pPr>
-        <w:overflowPunct w:val="false"/>
+        <w:overflowPunct w:val="true"/>
         <w:spacing w:before="0" w:after="0"/>
         <w:rPr/>
       </w:pPr>
@@ -6575,7 +6567,7 @@
   <w:comment w:id="5" w:author="Christoph Ammer-Herrmenau" w:date="2026-04-22T21:34:00Z" w:initials="CA">
     <w:p>
       <w:pPr>
-        <w:overflowPunct w:val="false"/>
+        <w:overflowPunct w:val="true"/>
         <w:spacing w:before="0" w:after="0"/>
         <w:rPr/>
       </w:pPr>
@@ -6591,7 +6583,7 @@
   <w:comment w:id="7" w:author="Christoph Ammer-Herrmenau" w:date="2026-04-22T21:54:00Z" w:initials="CA">
     <w:p>
       <w:pPr>
-        <w:overflowPunct w:val="false"/>
+        <w:overflowPunct w:val="true"/>
         <w:spacing w:before="0" w:after="0"/>
         <w:rPr/>
       </w:pPr>
@@ -6607,7 +6599,7 @@
   <w:comment w:id="6" w:author="Christoph Ammer-Herrmenau" w:date="2026-04-22T21:55:00Z" w:initials="CA">
     <w:p>
       <w:pPr>
-        <w:overflowPunct w:val="false"/>
+        <w:overflowPunct w:val="true"/>
         <w:spacing w:before="0" w:after="0"/>
         <w:rPr/>
       </w:pPr>
@@ -6623,7 +6615,7 @@
   <w:comment w:id="8" w:author="Christoph Ammer-Herrmenau" w:date="2026-04-22T21:37:00Z" w:initials="CA">
     <w:p>
       <w:pPr>
-        <w:overflowPunct w:val="false"/>
+        <w:overflowPunct w:val="true"/>
         <w:spacing w:before="0" w:after="0"/>
         <w:rPr/>
       </w:pPr>
@@ -6639,7 +6631,7 @@
   <w:comment w:id="9" w:author="Christoph Ammer-Herrmenau" w:date="2026-04-22T21:40:00Z" w:initials="CA">
     <w:p>
       <w:pPr>
-        <w:overflowPunct w:val="false"/>
+        <w:overflowPunct w:val="true"/>
         <w:spacing w:before="0" w:after="0"/>
         <w:rPr/>
       </w:pPr>
@@ -6655,7 +6647,7 @@
   <w:comment w:id="10" w:author="Christoph Ammer-Herrmenau" w:date="2026-04-23T21:35:00Z" w:initials="CA">
     <w:p>
       <w:pPr>
-        <w:overflowPunct w:val="false"/>
+        <w:overflowPunct w:val="true"/>
         <w:spacing w:before="0" w:after="0"/>
         <w:rPr/>
       </w:pPr>
@@ -6671,7 +6663,7 @@
   <w:comment w:id="11" w:author="Christoph Ammer-Herrmenau" w:date="2026-04-22T21:56:00Z" w:initials="CA">
     <w:p>
       <w:pPr>
-        <w:overflowPunct w:val="false"/>
+        <w:overflowPunct w:val="true"/>
         <w:spacing w:before="0" w:after="0"/>
         <w:rPr/>
       </w:pPr>
@@ -6687,7 +6679,7 @@
   <w:comment w:id="12" w:author="Christoph Ammer-Herrmenau" w:date="2026-04-22T21:57:00Z" w:initials="CA">
     <w:p>
       <w:pPr>
-        <w:overflowPunct w:val="false"/>
+        <w:overflowPunct w:val="true"/>
         <w:spacing w:before="0" w:after="0"/>
         <w:rPr/>
       </w:pPr>
@@ -6703,7 +6695,7 @@
   <w:comment w:id="13" w:author="Christoph Ammer-Herrmenau" w:date="2026-04-22T21:58:00Z" w:initials="CA">
     <w:p>
       <w:pPr>
-        <w:overflowPunct w:val="false"/>
+        <w:overflowPunct w:val="true"/>
         <w:spacing w:before="0" w:after="0"/>
         <w:rPr/>
       </w:pPr>
@@ -6719,7 +6711,7 @@
   <w:comment w:id="14" w:author="Christoph Ammer-Herrmenau" w:date="2026-04-22T21:59:00Z" w:initials="CA">
     <w:p>
       <w:pPr>
-        <w:overflowPunct w:val="false"/>
+        <w:overflowPunct w:val="true"/>
         <w:spacing w:before="0" w:after="0"/>
         <w:rPr/>
       </w:pPr>
@@ -6733,7 +6725,7 @@
     </w:p>
     <w:p>
       <w:pPr>
-        <w:overflowPunct w:val="false"/>
+        <w:overflowPunct w:val="true"/>
         <w:spacing w:before="0" w:after="0"/>
         <w:rPr/>
       </w:pPr>
@@ -6749,7 +6741,7 @@
   <w:comment w:id="15" w:author="Unknown Author" w:date="2026-05-29T10:07:22Z" w:initials="">
     <w:p>
       <w:pPr>
-        <w:overflowPunct w:val="false"/>
+        <w:overflowPunct w:val="true"/>
         <w:spacing w:before="0" w:after="0"/>
         <w:rPr/>
       </w:pPr>
@@ -6758,14 +6750,14 @@
           <w:rFonts w:ascii="Liberation Serif" w:hAnsi="Liberation Serif" w:eastAsia="DejaVu Sans" w:cs="Noto Sans Arabic UI"/>
           <w:lang w:val="en-US" w:eastAsia="en-US" w:bidi="en-US"/>
         </w:rPr>
-        <w:t>The story line here may be different</w:t>
+        <w:t>The story line here may be different (LD)</w:t>
       </w:r>
     </w:p>
   </w:comment>
   <w:comment w:id="16" w:author="Christoph Ammer-Herrmenau" w:date="2026-04-23T21:33:00Z" w:initials="CA">
     <w:p>
       <w:pPr>
-        <w:overflowPunct w:val="false"/>
+        <w:overflowPunct w:val="true"/>
         <w:spacing w:before="0" w:after="0"/>
         <w:rPr/>
       </w:pPr>
@@ -6781,7 +6773,7 @@
   <w:comment w:id="17" w:author="Christoph Ammer-Herrmenau" w:date="2026-04-23T21:43:00Z" w:initials="CA">
     <w:p>
       <w:pPr>
-        <w:overflowPunct w:val="false"/>
+        <w:overflowPunct w:val="true"/>
         <w:spacing w:before="0" w:after="0"/>
         <w:rPr/>
       </w:pPr>
@@ -6813,7 +6805,7 @@
   <w:comment w:id="18" w:author="Christoph Ammer-Herrmenau" w:date="2026-04-23T21:40:00Z" w:initials="CA">
     <w:p>
       <w:pPr>
-        <w:overflowPunct w:val="false"/>
+        <w:overflowPunct w:val="true"/>
         <w:spacing w:before="0" w:after="0"/>
         <w:rPr/>
       </w:pPr>
@@ -6829,7 +6821,7 @@
   <w:comment w:id="19" w:author="Christoph Ammer-Herrmenau" w:date="2026-04-23T21:40:00Z" w:initials="CA">
     <w:p>
       <w:pPr>
-        <w:overflowPunct w:val="false"/>
+        <w:overflowPunct w:val="true"/>
         <w:spacing w:before="0" w:after="0"/>
         <w:rPr/>
       </w:pPr>
@@ -6845,7 +6837,7 @@
   <w:comment w:id="20" w:author="Christoph Ammer-Herrmenau" w:date="2026-04-23T21:45:00Z" w:initials="CA">
     <w:p>
       <w:pPr>
-        <w:overflowPunct w:val="false"/>
+        <w:overflowPunct w:val="true"/>
         <w:spacing w:before="0" w:after="0"/>
         <w:rPr/>
       </w:pPr>
@@ -6861,7 +6853,7 @@
   <w:comment w:id="21" w:author="Christoph Ammer-Herrmenau" w:date="2026-04-23T21:50:00Z" w:initials="CA">
     <w:p>
       <w:pPr>
-        <w:overflowPunct w:val="false"/>
+        <w:overflowPunct w:val="true"/>
         <w:spacing w:before="0" w:after="0"/>
         <w:rPr/>
       </w:pPr>
@@ -6877,7 +6869,7 @@
   <w:comment w:id="22" w:author="Christoph Ammer-Herrmenau" w:date="2026-04-23T21:54:00Z" w:initials="CA">
     <w:p>
       <w:pPr>
-        <w:overflowPunct w:val="false"/>
+        <w:overflowPunct w:val="true"/>
         <w:spacing w:before="0" w:after="0"/>
         <w:rPr/>
       </w:pPr>
@@ -6893,7 +6885,7 @@
   <w:comment w:id="23" w:author="Christoph Ammer-Herrmenau" w:date="2026-04-24T21:14:00Z" w:initials="CA">
     <w:p>
       <w:pPr>
-        <w:overflowPunct w:val="false"/>
+        <w:overflowPunct w:val="true"/>
         <w:spacing w:before="0" w:after="0"/>
         <w:rPr/>
       </w:pPr>
@@ -6906,10 +6898,10 @@
       </w:r>
     </w:p>
   </w:comment>
-  <w:comment w:id="24" w:author="Christoph Ammer-Herrmenau" w:date="2026-04-24T22:59:00Z" w:initials="CA">
-    <w:p>
-      <w:pPr>
-        <w:overflowPunct w:val="false"/>
+  <w:comment w:id="25" w:author="Christoph Ammer-Herrmenau" w:date="2026-04-24T22:59:00Z" w:initials="CA">
+    <w:p>
+      <w:pPr>
+        <w:overflowPunct w:val="true"/>
         <w:spacing w:before="0" w:after="0"/>
         <w:rPr/>
       </w:pPr>
@@ -6922,10 +6914,10 @@
       </w:r>
     </w:p>
   </w:comment>
-  <w:comment w:id="25" w:author="Christoph Ammer-Herrmenau" w:date="2026-04-24T23:00:00Z" w:initials="CA">
-    <w:p>
-      <w:pPr>
-        <w:overflowPunct w:val="false"/>
+  <w:comment w:id="24" w:author="Christoph Ammer-Herrmenau" w:date="2026-04-24T23:00:00Z" w:initials="CA">
+    <w:p>
+      <w:pPr>
+        <w:overflowPunct w:val="true"/>
         <w:spacing w:before="0" w:after="0"/>
         <w:rPr/>
       </w:pPr>
@@ -6941,7 +6933,7 @@
   <w:comment w:id="26" w:author="Christoph Ammer-Herrmenau" w:date="2026-04-24T21:06:00Z" w:initials="CA">
     <w:p>
       <w:pPr>
-        <w:overflowPunct w:val="false"/>
+        <w:overflowPunct w:val="true"/>
         <w:spacing w:before="0" w:after="0"/>
         <w:rPr/>
       </w:pPr>
@@ -6957,7 +6949,7 @@
   <w:comment w:id="27" w:author="Christoph Ammer-Herrmenau" w:date="2026-04-24T23:01:00Z" w:initials="CA">
     <w:p>
       <w:pPr>
-        <w:overflowPunct w:val="false"/>
+        <w:overflowPunct w:val="true"/>
         <w:spacing w:before="0" w:after="0"/>
         <w:rPr/>
       </w:pPr>
@@ -6973,7 +6965,7 @@
   <w:comment w:id="28" w:author="Christoph Ammer-Herrmenau" w:date="2026-04-24T21:09:00Z" w:initials="CA">
     <w:p>
       <w:pPr>
-        <w:overflowPunct w:val="false"/>
+        <w:overflowPunct w:val="true"/>
         <w:spacing w:before="0" w:after="0"/>
         <w:rPr/>
       </w:pPr>
@@ -6989,7 +6981,7 @@
   <w:comment w:id="29" w:author="Christoph Ammer-Herrmenau" w:date="2026-04-24T21:07:00Z" w:initials="CA">
     <w:p>
       <w:pPr>
-        <w:overflowPunct w:val="false"/>
+        <w:overflowPunct w:val="true"/>
         <w:spacing w:before="0" w:after="0"/>
         <w:rPr/>
       </w:pPr>
@@ -7005,7 +6997,7 @@
   <w:comment w:id="30" w:author="Christoph Ammer-Herrmenau" w:date="2026-04-24T21:13:00Z" w:initials="CA">
     <w:p>
       <w:pPr>
-        <w:overflowPunct w:val="false"/>
+        <w:overflowPunct w:val="true"/>
         <w:spacing w:before="0" w:after="0"/>
         <w:rPr/>
       </w:pPr>
@@ -7021,7 +7013,7 @@
   <w:comment w:id="31" w:author="Christoph Ammer-Herrmenau" w:date="2026-04-24T21:11:00Z" w:initials="CA">
     <w:p>
       <w:pPr>
-        <w:overflowPunct w:val="false"/>
+        <w:overflowPunct w:val="true"/>
         <w:spacing w:before="0" w:after="0"/>
         <w:rPr/>
       </w:pPr>
@@ -7037,7 +7029,7 @@
   <w:comment w:id="32" w:author="Christoph Ammer-Herrmenau" w:date="2026-04-24T21:14:00Z" w:initials="CA">
     <w:p>
       <w:pPr>
-        <w:overflowPunct w:val="false"/>
+        <w:overflowPunct w:val="true"/>
         <w:spacing w:before="0" w:after="0"/>
         <w:rPr/>
       </w:pPr>
@@ -7053,7 +7045,7 @@
   <w:comment w:id="33" w:author="Christoph Ammer-Herrmenau" w:date="2026-04-24T23:03:00Z" w:initials="CA">
     <w:p>
       <w:pPr>
-        <w:overflowPunct w:val="false"/>
+        <w:overflowPunct w:val="true"/>
         <w:spacing w:before="0" w:after="0"/>
         <w:rPr/>
       </w:pPr>
@@ -7069,7 +7061,7 @@
   <w:comment w:id="34" w:author="Christoph Ammer-Herrmenau" w:date="2026-04-25T21:02:00Z" w:initials="CA">
     <w:p>
       <w:pPr>
-        <w:overflowPunct w:val="false"/>
+        <w:overflowPunct w:val="true"/>
         <w:spacing w:before="0" w:after="0"/>
         <w:rPr/>
       </w:pPr>
@@ -7085,7 +7077,7 @@
   <w:comment w:id="35" w:author="Christoph Ammer-Herrmenau" w:date="2026-04-25T21:20:00Z" w:initials="CA">
     <w:p>
       <w:pPr>
-        <w:overflowPunct w:val="false"/>
+        <w:overflowPunct w:val="true"/>
         <w:spacing w:before="0" w:after="0"/>
         <w:rPr/>
       </w:pPr>
@@ -7101,7 +7093,7 @@
   <w:comment w:id="36" w:author="Christoph Ammer-Herrmenau" w:date="2026-04-25T21:21:00Z" w:initials="CA">
     <w:p>
       <w:pPr>
-        <w:overflowPunct w:val="false"/>
+        <w:overflowPunct w:val="true"/>
         <w:spacing w:before="0" w:after="0"/>
         <w:rPr/>
       </w:pPr>
@@ -7117,7 +7109,7 @@
   <w:comment w:id="37" w:author="Christoph Ammer-Herrmenau" w:date="2026-04-25T21:21:00Z" w:initials="CA">
     <w:p>
       <w:pPr>
-        <w:overflowPunct w:val="false"/>
+        <w:overflowPunct w:val="true"/>
         <w:spacing w:before="0" w:after="0"/>
         <w:rPr/>
       </w:pPr>
@@ -7133,7 +7125,7 @@
   <w:comment w:id="38" w:author="Christoph Ammer-Herrmenau" w:date="2026-04-25T21:45:00Z" w:initials="CA">
     <w:p>
       <w:pPr>
-        <w:overflowPunct w:val="false"/>
+        <w:overflowPunct w:val="true"/>
         <w:spacing w:before="0" w:after="0"/>
         <w:rPr/>
       </w:pPr>
@@ -7149,7 +7141,7 @@
   <w:comment w:id="40" w:author="Christoph Ammer-Herrmenau" w:date="2026-04-25T21:50:00Z" w:initials="CA">
     <w:p>
       <w:pPr>
-        <w:overflowPunct w:val="false"/>
+        <w:overflowPunct w:val="true"/>
         <w:spacing w:before="0" w:after="0"/>
         <w:rPr/>
       </w:pPr>
@@ -7165,7 +7157,7 @@
   <w:comment w:id="39" w:author="Christoph Ammer-Herrmenau" w:date="2026-04-25T21:52:00Z" w:initials="CA">
     <w:p>
       <w:pPr>
-        <w:overflowPunct w:val="false"/>
+        <w:overflowPunct w:val="true"/>
         <w:spacing w:before="0" w:after="0"/>
         <w:rPr/>
       </w:pPr>
@@ -7181,7 +7173,7 @@
   <w:comment w:id="41" w:author="Christoph Ammer-Herrmenau" w:date="2026-04-25T21:47:00Z" w:initials="CA">
     <w:p>
       <w:pPr>
-        <w:overflowPunct w:val="false"/>
+        <w:overflowPunct w:val="true"/>
         <w:spacing w:before="0" w:after="0"/>
         <w:rPr/>
       </w:pPr>
@@ -7197,7 +7189,7 @@
   <w:comment w:id="42" w:author="Christoph Ammer-Herrmenau" w:date="2026-04-25T22:00:00Z" w:initials="CA">
     <w:p>
       <w:pPr>
-        <w:overflowPunct w:val="false"/>
+        <w:overflowPunct w:val="true"/>
         <w:spacing w:before="0" w:after="0"/>
         <w:rPr/>
       </w:pPr>
@@ -7213,7 +7205,7 @@
   <w:comment w:id="43" w:author="Christoph Ammer-Herrmenau" w:date="2026-04-25T22:01:00Z" w:initials="CA">
     <w:p>
       <w:pPr>
-        <w:overflowPunct w:val="false"/>
+        <w:overflowPunct w:val="true"/>
         <w:spacing w:before="0" w:after="0"/>
         <w:rPr/>
       </w:pPr>
@@ -7229,7 +7221,7 @@
   <w:comment w:id="44" w:author="Christoph Ammer-Herrmenau" w:date="2026-04-25T22:09:00Z" w:initials="CA">
     <w:p>
       <w:pPr>
-        <w:overflowPunct w:val="false"/>
+        <w:overflowPunct w:val="true"/>
         <w:spacing w:before="0" w:after="0"/>
         <w:rPr/>
       </w:pPr>
@@ -7245,7 +7237,7 @@
   <w:comment w:id="45" w:author="Christoph Ammer-Herrmenau" w:date="2026-04-25T22:24:00Z" w:initials="CA">
     <w:p>
       <w:pPr>
-        <w:overflowPunct w:val="false"/>
+        <w:overflowPunct w:val="true"/>
         <w:spacing w:before="0" w:after="0"/>
         <w:rPr/>
       </w:pPr>
@@ -7261,7 +7253,7 @@
   <w:comment w:id="46" w:author="Christoph Ammer-Herrmenau" w:date="2026-04-25T22:28:00Z" w:initials="CA">
     <w:p>
       <w:pPr>
-        <w:overflowPunct w:val="false"/>
+        <w:overflowPunct w:val="true"/>
         <w:spacing w:before="0" w:after="0"/>
         <w:rPr/>
       </w:pPr>
@@ -7277,7 +7269,7 @@
   <w:comment w:id="47" w:author="Christoph Ammer-Herrmenau" w:date="2026-04-25T22:33:00Z" w:initials="CA">
     <w:p>
       <w:pPr>
-        <w:overflowPunct w:val="false"/>
+        <w:overflowPunct w:val="true"/>
         <w:spacing w:before="0" w:after="0"/>
         <w:rPr/>
       </w:pPr>
@@ -7325,7 +7317,7 @@
   <w:comment w:id="48" w:author="Christoph Ammer-Herrmenau" w:date="2026-04-25T22:22:00Z" w:initials="CA">
     <w:p>
       <w:pPr>
-        <w:overflowPunct w:val="false"/>
+        <w:overflowPunct w:val="true"/>
         <w:spacing w:before="0" w:after="0"/>
         <w:rPr/>
       </w:pPr>
@@ -7341,7 +7333,7 @@
   <w:comment w:id="49" w:author="Christoph Ammer-Herrmenau" w:date="2026-04-25T22:21:00Z" w:initials="CA">
     <w:p>
       <w:pPr>
-        <w:overflowPunct w:val="false"/>
+        <w:overflowPunct w:val="true"/>
         <w:spacing w:before="0" w:after="0"/>
         <w:rPr/>
       </w:pPr>
@@ -7357,7 +7349,7 @@
   <w:comment w:id="50" w:author="Christoph Ammer-Herrmenau" w:date="2026-04-25T22:34:00Z" w:initials="CA">
     <w:p>
       <w:pPr>
-        <w:overflowPunct w:val="false"/>
+        <w:overflowPunct w:val="true"/>
         <w:spacing w:before="0" w:after="0"/>
         <w:rPr/>
       </w:pPr>
@@ -7660,142 +7652,6 @@
   </w:abstractNum>
   <w:abstractNum w:abstractNumId="3">
     <w:lvl w:ilvl="0">
-      <w:numFmt w:val="bullet"/>
-      <w:lvlText w:val=""/>
-      <w:lvlJc w:val="left"/>
-      <w:pPr>
-        <w:tabs>
-          <w:tab w:val="num" w:pos="0"/>
-        </w:tabs>
-        <w:ind w:left="720" w:hanging="360"/>
-      </w:pPr>
-      <w:rPr>
-        <w:rFonts w:ascii="Symbol" w:hAnsi="Symbol" w:cs="Symbol" w:hint="default"/>
-      </w:rPr>
-    </w:lvl>
-    <w:lvl w:ilvl="1">
-      <w:start w:val="0"/>
-      <w:numFmt w:val="bullet"/>
-      <w:lvlText w:val="o"/>
-      <w:lvlJc w:val="left"/>
-      <w:pPr>
-        <w:tabs>
-          <w:tab w:val="num" w:pos="0"/>
-        </w:tabs>
-        <w:ind w:left="1440" w:hanging="360"/>
-      </w:pPr>
-      <w:rPr>
-        <w:rFonts w:ascii="Courier New" w:hAnsi="Courier New" w:cs="Courier New" w:hint="default"/>
-      </w:rPr>
-    </w:lvl>
-    <w:lvl w:ilvl="2">
-      <w:start w:val="0"/>
-      <w:numFmt w:val="bullet"/>
-      <w:lvlText w:val=""/>
-      <w:lvlJc w:val="left"/>
-      <w:pPr>
-        <w:tabs>
-          <w:tab w:val="num" w:pos="0"/>
-        </w:tabs>
-        <w:ind w:left="2160" w:hanging="360"/>
-      </w:pPr>
-      <w:rPr>
-        <w:rFonts w:ascii="Wingdings" w:hAnsi="Wingdings" w:cs="Wingdings" w:hint="default"/>
-      </w:rPr>
-    </w:lvl>
-    <w:lvl w:ilvl="3">
-      <w:start w:val="0"/>
-      <w:numFmt w:val="bullet"/>
-      <w:lvlText w:val=""/>
-      <w:lvlJc w:val="left"/>
-      <w:pPr>
-        <w:tabs>
-          <w:tab w:val="num" w:pos="0"/>
-        </w:tabs>
-        <w:ind w:left="2880" w:hanging="360"/>
-      </w:pPr>
-      <w:rPr>
-        <w:rFonts w:ascii="Symbol" w:hAnsi="Symbol" w:cs="Symbol" w:hint="default"/>
-      </w:rPr>
-    </w:lvl>
-    <w:lvl w:ilvl="4">
-      <w:start w:val="0"/>
-      <w:numFmt w:val="bullet"/>
-      <w:lvlText w:val="o"/>
-      <w:lvlJc w:val="left"/>
-      <w:pPr>
-        <w:tabs>
-          <w:tab w:val="num" w:pos="0"/>
-        </w:tabs>
-        <w:ind w:left="3600" w:hanging="360"/>
-      </w:pPr>
-      <w:rPr>
-        <w:rFonts w:ascii="Courier New" w:hAnsi="Courier New" w:cs="Courier New" w:hint="default"/>
-      </w:rPr>
-    </w:lvl>
-    <w:lvl w:ilvl="5">
-      <w:start w:val="0"/>
-      <w:numFmt w:val="bullet"/>
-      <w:lvlText w:val=""/>
-      <w:lvlJc w:val="left"/>
-      <w:pPr>
-        <w:tabs>
-          <w:tab w:val="num" w:pos="0"/>
-        </w:tabs>
-        <w:ind w:left="4320" w:hanging="360"/>
-      </w:pPr>
-      <w:rPr>
-        <w:rFonts w:ascii="Wingdings" w:hAnsi="Wingdings" w:cs="Wingdings" w:hint="default"/>
-      </w:rPr>
-    </w:lvl>
-    <w:lvl w:ilvl="6">
-      <w:start w:val="0"/>
-      <w:numFmt w:val="bullet"/>
-      <w:lvlText w:val=""/>
-      <w:lvlJc w:val="left"/>
-      <w:pPr>
-        <w:tabs>
-          <w:tab w:val="num" w:pos="0"/>
-        </w:tabs>
-        <w:ind w:left="5040" w:hanging="360"/>
-      </w:pPr>
-      <w:rPr>
-        <w:rFonts w:ascii="Symbol" w:hAnsi="Symbol" w:cs="Symbol" w:hint="default"/>
-      </w:rPr>
-    </w:lvl>
-    <w:lvl w:ilvl="7">
-      <w:start w:val="0"/>
-      <w:numFmt w:val="bullet"/>
-      <w:lvlText w:val="o"/>
-      <w:lvlJc w:val="left"/>
-      <w:pPr>
-        <w:tabs>
-          <w:tab w:val="num" w:pos="0"/>
-        </w:tabs>
-        <w:ind w:left="5760" w:hanging="360"/>
-      </w:pPr>
-      <w:rPr>
-        <w:rFonts w:ascii="Courier New" w:hAnsi="Courier New" w:cs="Courier New" w:hint="default"/>
-      </w:rPr>
-    </w:lvl>
-    <w:lvl w:ilvl="8">
-      <w:start w:val="0"/>
-      <w:numFmt w:val="bullet"/>
-      <w:lvlText w:val=""/>
-      <w:lvlJc w:val="left"/>
-      <w:pPr>
-        <w:tabs>
-          <w:tab w:val="num" w:pos="0"/>
-        </w:tabs>
-        <w:ind w:left="6480" w:hanging="360"/>
-      </w:pPr>
-      <w:rPr>
-        <w:rFonts w:ascii="Wingdings" w:hAnsi="Wingdings" w:cs="Wingdings" w:hint="default"/>
-      </w:rPr>
-    </w:lvl>
-  </w:abstractNum>
-  <w:abstractNum w:abstractNumId="4">
-    <w:lvl w:ilvl="0">
       <w:start w:val="1"/>
       <w:numFmt w:val="none"/>
       <w:suff w:val="nothing"/>
@@ -7923,12 +7779,6 @@
     <w:abstractNumId w:val="3"/>
   </w:num>
   <w:num w:numId="4">
-    <w:abstractNumId w:val="4"/>
-  </w:num>
-  <w:num w:numId="5">
-    <w:abstractNumId w:val="1"/>
-  </w:num>
-  <w:num w:numId="6">
     <w:abstractNumId w:val="1"/>
   </w:num>
 </w:numbering>
@@ -9348,12 +9198,12 @@
       <w:jc w:val="left"/>
     </w:pPr>
     <w:rPr>
-      <w:rFonts w:eastAsia="" w:eastAsiaTheme="minorEastAsia" w:ascii="Aptos" w:hAnsi="Aptos" w:cs=""/>
+      <w:rFonts w:ascii="Aptos" w:hAnsi="Aptos" w:eastAsia="" w:cs="" w:eastAsiaTheme="minorEastAsia"/>
       <w:color w:val="auto"/>
       <w:kern w:val="0"/>
       <w:sz w:val="22"/>
       <w:szCs w:val="28"/>
-      <w:lang w:eastAsia="ko-KR" w:bidi="bn-BD" w:val="en-US"/>
+      <w:lang w:val="en-US" w:eastAsia="ko-KR" w:bidi="bn-BD"/>
     </w:rPr>
   </w:style>
   <w:style w:type="paragraph" w:styleId="AnnotationText">

</xml_diff>